<commit_message>
Day24-Telemetry: guard core AI call, always flush traces, add project.md
InvokePromptAsync was unguarded, and a failure would also skip
tracerProvider.ForceFlush() - so a failed run produced zero trace
output, directly undermining a lesson whose whole point is showing
what OTel captures. Wraps the call in try/catch and moves ForceFlush
into a finally so traces print either way. Syncs the docx's Complete
Code listing and replaces missing.md with project.md.
</commit_message>
<xml_diff>
--- a/Day24-Telemetry.docx
+++ b/Day24-Telemetry.docx
@@ -115,19 +115,16 @@
         <w:ind w:left="1080"/>
       </w:pPr>
       <w:r>
-        <w:t>Note: The API key is read from the `GEMINI_API_KEY` environment variable; the program throws immediately at startup if it is not set. The `TracerProvider` must be built and its `AddSource("Microsoft.SemanticKernel*")` call</w:t>
-      </w:r>
+        <w:t>Note: The API key is read from the `GEMINI_API_KEY` environment variable; the program throws immediately at startup if it is not set. The `TracerProvider` must be built and its `AddSource("Microsoft.SemanticKernel*")` call registered *before* any kernel operations run, or the corresponding activities will never be captured. `tracerProvider.ForceFlush()` is called at the end to guarantee buffered trace data is written to the console before the process exits.</w:t>
+      </w:r>
+    </w:p>
+    <w:p/>
+    <w:p>
+      <w:pPr>
+        <w:pStyle w:val="Heading2"/>
+      </w:pPr>
       <w:r>
         <w:lastRenderedPageBreak/>
-        <w:t xml:space="preserve"> registered *before* any kernel operations run, or the corresponding activities will never be captured. `tracerProvider.ForceFlush()` is called at the end to guarantee buffered trace data is written to the console before the process exits.</w:t>
-      </w:r>
-    </w:p>
-    <w:p/>
-    <w:p>
-      <w:pPr>
-        <w:pStyle w:val="Heading2"/>
-      </w:pPr>
-      <w:r>
         <w:t>3. Core Concepts Covered</w:t>
       </w:r>
     </w:p>
@@ -204,11 +201,7 @@
         <w:t>Spans and Durations</w:t>
       </w:r>
       <w:r>
-        <w:t>: Each traced `Activity`</w:t>
-      </w:r>
-      <w:r>
-        <w:lastRenderedPageBreak/>
-        <w:t xml:space="preserve"> (a "span") represents one unit of work — an LLM call or a plugin execution — and carries a measurable `Duration`, letting you see exactly where time is spent in an agentic request.</w:t>
+        <w:t>: Each traced `Activity` (a "span") represents one unit of work — an LLM call or a plugin execution — and carries a measurable `Duration`, letting you see exactly where time is spent in an agentic request.</w:t>
       </w:r>
     </w:p>
     <w:p>
@@ -333,143 +326,1396 @@
           <w:rFonts w:ascii="Consolas" w:hAnsi="Consolas"/>
           <w:sz w:val="19"/>
         </w:rPr>
-        <w:t>// diagnostic ActivitySource so every prompt render, model call, and</w:t>
-      </w:r>
+        <w:t>// diagnostic ActivitySource so every prompt render, model call, and plugin</w:t>
+      </w:r>
+    </w:p>
+    <w:p>
+      <w:pPr>
+        <w:pStyle w:val="NoSpacing"/>
+        <w:rPr>
+          <w:rFonts w:ascii="Consolas" w:hAnsi="Consolas"/>
+          <w:sz w:val="19"/>
+        </w:rPr>
+      </w:pPr>
+      <w:r>
+        <w:rPr>
+          <w:rFonts w:ascii="Consolas" w:hAnsi="Consolas"/>
+          <w:sz w:val="19"/>
+        </w:rPr>
+        <w:t>// execution shows up as a traced span with real durations.</w:t>
+      </w:r>
+    </w:p>
+    <w:p>
+      <w:pPr>
+        <w:pStyle w:val="NoSpacing"/>
+        <w:rPr>
+          <w:rFonts w:ascii="Consolas" w:hAnsi="Consolas"/>
+          <w:sz w:val="19"/>
+        </w:rPr>
+      </w:pPr>
+      <w:r>
+        <w:rPr>
+          <w:rFonts w:ascii="Consolas" w:hAnsi="Consolas"/>
+          <w:sz w:val="19"/>
+        </w:rPr>
+        <w:t>// SlowWeatherPlugin's artificial delay makes the tool-execution span clearly</w:t>
+      </w:r>
+    </w:p>
+    <w:p>
+      <w:pPr>
+        <w:pStyle w:val="NoSpacing"/>
+        <w:rPr>
+          <w:rFonts w:ascii="Consolas" w:hAnsi="Consolas"/>
+          <w:sz w:val="19"/>
+        </w:rPr>
+      </w:pPr>
+      <w:r>
+        <w:rPr>
+          <w:rFonts w:ascii="Consolas" w:hAnsi="Consolas"/>
+          <w:sz w:val="19"/>
+        </w:rPr>
+        <w:t>// distinct from the surrounding LLM-call spans in the console output. This</w:t>
+      </w:r>
+    </w:p>
+    <w:p>
+      <w:pPr>
+        <w:pStyle w:val="NoSpacing"/>
+        <w:rPr>
+          <w:rFonts w:ascii="Consolas" w:hAnsi="Consolas"/>
+          <w:sz w:val="19"/>
+        </w:rPr>
+      </w:pPr>
+      <w:r>
+        <w:rPr>
+          <w:rFonts w:ascii="Consolas" w:hAnsi="Consolas"/>
+          <w:sz w:val="19"/>
+        </w:rPr>
+        <w:t>// is provider-agnostic by construction - OTel listens to SK's own</w:t>
+      </w:r>
+    </w:p>
+    <w:p>
+      <w:pPr>
+        <w:pStyle w:val="NoSpacing"/>
+        <w:rPr>
+          <w:rFonts w:ascii="Consolas" w:hAnsi="Consolas"/>
+          <w:sz w:val="19"/>
+        </w:rPr>
+      </w:pPr>
+      <w:r>
+        <w:rPr>
+          <w:rFonts w:ascii="Consolas" w:hAnsi="Consolas"/>
+          <w:sz w:val="19"/>
+        </w:rPr>
+        <w:t>// instrumentation, not to Gemini specifically, so the tracing keeps working</w:t>
+      </w:r>
+    </w:p>
+    <w:p>
+      <w:pPr>
+        <w:pStyle w:val="NoSpacing"/>
+        <w:rPr>
+          <w:rFonts w:ascii="Consolas" w:hAnsi="Consolas"/>
+          <w:sz w:val="19"/>
+        </w:rPr>
+      </w:pPr>
+      <w:r>
+        <w:rPr>
+          <w:rFonts w:ascii="Consolas" w:hAnsi="Consolas"/>
+          <w:sz w:val="19"/>
+        </w:rPr>
+        <w:t>// identically no matter which connector is registered below.</w:t>
+      </w:r>
+    </w:p>
+    <w:p>
+      <w:pPr>
+        <w:pStyle w:val="NoSpacing"/>
+        <w:rPr>
+          <w:rFonts w:ascii="Consolas" w:hAnsi="Consolas"/>
+          <w:sz w:val="19"/>
+        </w:rPr>
+      </w:pPr>
+      <w:r>
+        <w:rPr>
+          <w:rFonts w:ascii="Consolas" w:hAnsi="Consolas"/>
+          <w:sz w:val="19"/>
+        </w:rPr>
+        <w:t>using System;</w:t>
+      </w:r>
+    </w:p>
+    <w:p>
+      <w:pPr>
+        <w:pStyle w:val="NoSpacing"/>
+        <w:rPr>
+          <w:rFonts w:ascii="Consolas" w:hAnsi="Consolas"/>
+          <w:sz w:val="19"/>
+        </w:rPr>
+      </w:pPr>
+      <w:r>
+        <w:rPr>
+          <w:rFonts w:ascii="Consolas" w:hAnsi="Consolas"/>
+          <w:sz w:val="19"/>
+        </w:rPr>
+        <w:t>using System.Threading.Tasks;</w:t>
+      </w:r>
+    </w:p>
+    <w:p>
+      <w:pPr>
+        <w:pStyle w:val="NoSpacing"/>
+        <w:rPr>
+          <w:rFonts w:ascii="Consolas" w:hAnsi="Consolas"/>
+          <w:sz w:val="19"/>
+        </w:rPr>
+      </w:pPr>
+      <w:r>
+        <w:rPr>
+          <w:rFonts w:ascii="Consolas" w:hAnsi="Consolas"/>
+          <w:sz w:val="19"/>
+        </w:rPr>
+        <w:t>using Microsoft.SemanticKernel;</w:t>
+      </w:r>
+    </w:p>
+    <w:p>
+      <w:pPr>
+        <w:pStyle w:val="NoSpacing"/>
+        <w:rPr>
+          <w:rFonts w:ascii="Consolas" w:hAnsi="Consolas"/>
+          <w:sz w:val="19"/>
+        </w:rPr>
+      </w:pPr>
+      <w:r>
+        <w:rPr>
+          <w:rFonts w:ascii="Consolas" w:hAnsi="Consolas"/>
+          <w:sz w:val="19"/>
+        </w:rPr>
+        <w:t>using Microsoft.SemanticKernel.Connectors.Google;</w:t>
+      </w:r>
+    </w:p>
+    <w:p>
+      <w:pPr>
+        <w:pStyle w:val="NoSpacing"/>
+        <w:rPr>
+          <w:rFonts w:ascii="Consolas" w:hAnsi="Consolas"/>
+          <w:sz w:val="19"/>
+        </w:rPr>
+      </w:pPr>
+      <w:r>
+        <w:rPr>
+          <w:rFonts w:ascii="Consolas" w:hAnsi="Consolas"/>
+          <w:sz w:val="19"/>
+        </w:rPr>
+        <w:t>using OpenTelemetry;</w:t>
+      </w:r>
+    </w:p>
+    <w:p>
+      <w:pPr>
+        <w:pStyle w:val="NoSpacing"/>
+        <w:rPr>
+          <w:rFonts w:ascii="Consolas" w:hAnsi="Consolas"/>
+          <w:sz w:val="19"/>
+        </w:rPr>
+      </w:pPr>
+      <w:r>
+        <w:rPr>
+          <w:rFonts w:ascii="Consolas" w:hAnsi="Consolas"/>
+          <w:sz w:val="19"/>
+        </w:rPr>
+        <w:t>using OpenTelemetry.Trace;</w:t>
+      </w:r>
+    </w:p>
+    <w:p>
+      <w:pPr>
+        <w:pStyle w:val="NoSpacing"/>
+        <w:rPr>
+          <w:rFonts w:ascii="Consolas" w:hAnsi="Consolas"/>
+          <w:sz w:val="19"/>
+        </w:rPr>
+      </w:pPr>
+    </w:p>
+    <w:p>
+      <w:pPr>
+        <w:pStyle w:val="NoSpacing"/>
+        <w:rPr>
+          <w:rFonts w:ascii="Consolas" w:hAnsi="Consolas"/>
+          <w:sz w:val="19"/>
+        </w:rPr>
+      </w:pPr>
+      <w:r>
+        <w:rPr>
+          <w:rFonts w:ascii="Consolas" w:hAnsi="Consolas"/>
+          <w:sz w:val="19"/>
+        </w:rPr>
+        <w:t>namespace Telemetry</w:t>
+      </w:r>
+    </w:p>
+    <w:p>
+      <w:pPr>
+        <w:pStyle w:val="NoSpacing"/>
+        <w:rPr>
+          <w:rFonts w:ascii="Consolas" w:hAnsi="Consolas"/>
+          <w:sz w:val="19"/>
+        </w:rPr>
+      </w:pPr>
+      <w:r>
+        <w:rPr>
+          <w:rFonts w:ascii="Consolas" w:hAnsi="Consolas"/>
+          <w:sz w:val="19"/>
+        </w:rPr>
+        <w:t>{</w:t>
+      </w:r>
+    </w:p>
+    <w:p>
+      <w:pPr>
+        <w:pStyle w:val="NoSpacing"/>
+        <w:rPr>
+          <w:rFonts w:ascii="Consolas" w:hAnsi="Consolas"/>
+          <w:sz w:val="19"/>
+        </w:rPr>
+      </w:pPr>
+      <w:r>
+        <w:rPr>
+          <w:rFonts w:ascii="Consolas" w:hAnsi="Consolas"/>
+          <w:sz w:val="19"/>
+        </w:rPr>
+        <w:t xml:space="preserve">    class Program</w:t>
+      </w:r>
+    </w:p>
+    <w:p>
+      <w:pPr>
+        <w:pStyle w:val="NoSpacing"/>
+        <w:rPr>
+          <w:rFonts w:ascii="Consolas" w:hAnsi="Consolas"/>
+          <w:sz w:val="19"/>
+        </w:rPr>
+      </w:pPr>
+      <w:r>
+        <w:rPr>
+          <w:rFonts w:ascii="Consolas" w:hAnsi="Consolas"/>
+          <w:sz w:val="19"/>
+        </w:rPr>
+        <w:t xml:space="preserve">    {</w:t>
+      </w:r>
+    </w:p>
+    <w:p>
+      <w:pPr>
+        <w:pStyle w:val="NoSpacing"/>
+        <w:rPr>
+          <w:rFonts w:ascii="Consolas" w:hAnsi="Consolas"/>
+          <w:sz w:val="19"/>
+        </w:rPr>
+      </w:pPr>
+      <w:r>
+        <w:rPr>
+          <w:rFonts w:ascii="Consolas" w:hAnsi="Consolas"/>
+          <w:sz w:val="19"/>
+        </w:rPr>
+        <w:t xml:space="preserve">        static async Task Main(string[] args)</w:t>
+      </w:r>
+    </w:p>
+    <w:p>
+      <w:pPr>
+        <w:pStyle w:val="NoSpacing"/>
+        <w:rPr>
+          <w:rFonts w:ascii="Consolas" w:hAnsi="Consolas"/>
+          <w:sz w:val="19"/>
+        </w:rPr>
+      </w:pPr>
+      <w:r>
+        <w:rPr>
+          <w:rFonts w:ascii="Consolas" w:hAnsi="Consolas"/>
+          <w:sz w:val="19"/>
+        </w:rPr>
+        <w:t xml:space="preserve">        {</w:t>
+      </w:r>
+    </w:p>
+    <w:p>
+      <w:pPr>
+        <w:pStyle w:val="NoSpacing"/>
+        <w:rPr>
+          <w:rFonts w:ascii="Consolas" w:hAnsi="Consolas"/>
+          <w:sz w:val="19"/>
+        </w:rPr>
+      </w:pPr>
+      <w:r>
+        <w:rPr>
+          <w:rFonts w:ascii="Consolas" w:hAnsi="Consolas"/>
+          <w:sz w:val="19"/>
+        </w:rPr>
+        <w:t xml:space="preserve">            // 1. Configure OpenTelemetry Tracing</w:t>
+      </w:r>
+    </w:p>
+    <w:p>
+      <w:pPr>
+        <w:pStyle w:val="NoSpacing"/>
+        <w:rPr>
+          <w:rFonts w:ascii="Consolas" w:hAnsi="Consolas"/>
+          <w:sz w:val="19"/>
+        </w:rPr>
+      </w:pPr>
+      <w:r>
+        <w:rPr>
+          <w:rFonts w:ascii="Consolas" w:hAnsi="Consolas"/>
+          <w:sz w:val="19"/>
+        </w:rPr>
+        <w:t xml:space="preserve">            // We use explicit lines rather than fluent chaining for clarity.</w:t>
+      </w:r>
+    </w:p>
+    <w:p>
+      <w:pPr>
+        <w:pStyle w:val="NoSpacing"/>
+        <w:rPr>
+          <w:rFonts w:ascii="Consolas" w:hAnsi="Consolas"/>
+          <w:sz w:val="19"/>
+        </w:rPr>
+      </w:pPr>
+      <w:r>
+        <w:rPr>
+          <w:rFonts w:ascii="Consolas" w:hAnsi="Consolas"/>
+          <w:sz w:val="19"/>
+        </w:rPr>
+        <w:t xml:space="preserve">            TracerProviderBuilder traceBuilder = Sdk.CreateTracerProviderBuilder();</w:t>
+      </w:r>
+    </w:p>
+    <w:p>
+      <w:pPr>
+        <w:pStyle w:val="NoSpacing"/>
+        <w:rPr>
+          <w:rFonts w:ascii="Consolas" w:hAnsi="Consolas"/>
+          <w:sz w:val="19"/>
+        </w:rPr>
+      </w:pPr>
+    </w:p>
+    <w:p>
+      <w:pPr>
+        <w:pStyle w:val="NoSpacing"/>
+        <w:rPr>
+          <w:rFonts w:ascii="Consolas" w:hAnsi="Consolas"/>
+          <w:sz w:val="19"/>
+        </w:rPr>
+      </w:pPr>
+      <w:r>
+        <w:rPr>
+          <w:rFonts w:ascii="Consolas" w:hAnsi="Consolas"/>
+          <w:sz w:val="19"/>
+        </w:rPr>
+        <w:t xml:space="preserve">            // Tell Open Telemetry to listen to all diagnostic events emitted by Semantic Kernel</w:t>
+      </w:r>
+    </w:p>
+    <w:p>
+      <w:pPr>
+        <w:pStyle w:val="NoSpacing"/>
+        <w:rPr>
+          <w:rFonts w:ascii="Consolas" w:hAnsi="Consolas"/>
+          <w:sz w:val="19"/>
+        </w:rPr>
+      </w:pPr>
+      <w:r>
+        <w:rPr>
+          <w:rFonts w:ascii="Consolas" w:hAnsi="Consolas"/>
+          <w:sz w:val="19"/>
+        </w:rPr>
+        <w:t xml:space="preserve">            traceBuilder.AddSource("Microsoft.SemanticKernel*");</w:t>
+      </w:r>
+    </w:p>
+    <w:p>
+      <w:pPr>
+        <w:pStyle w:val="NoSpacing"/>
+        <w:rPr>
+          <w:rFonts w:ascii="Consolas" w:hAnsi="Consolas"/>
+          <w:sz w:val="19"/>
+        </w:rPr>
+      </w:pPr>
+    </w:p>
+    <w:p>
+      <w:pPr>
+        <w:pStyle w:val="NoSpacing"/>
+        <w:rPr>
+          <w:rFonts w:ascii="Consolas" w:hAnsi="Consolas"/>
+          <w:sz w:val="19"/>
+        </w:rPr>
+      </w:pPr>
+      <w:r>
+        <w:rPr>
+          <w:rFonts w:ascii="Consolas" w:hAnsi="Consolas"/>
+          <w:sz w:val="19"/>
+        </w:rPr>
+        <w:t xml:space="preserve">            // Output the raw trace data directly to our console window for this tutorial</w:t>
+      </w:r>
+    </w:p>
+    <w:p>
+      <w:pPr>
+        <w:pStyle w:val="NoSpacing"/>
+        <w:rPr>
+          <w:rFonts w:ascii="Consolas" w:hAnsi="Consolas"/>
+          <w:sz w:val="19"/>
+        </w:rPr>
+      </w:pPr>
+      <w:r>
+        <w:rPr>
+          <w:rFonts w:ascii="Consolas" w:hAnsi="Consolas"/>
+          <w:sz w:val="19"/>
+        </w:rPr>
+        <w:t xml:space="preserve">            traceBuilder.AddConsoleExporter();</w:t>
+      </w:r>
+    </w:p>
+    <w:p>
+      <w:pPr>
+        <w:pStyle w:val="NoSpacing"/>
+        <w:rPr>
+          <w:rFonts w:ascii="Consolas" w:hAnsi="Consolas"/>
+          <w:sz w:val="19"/>
+        </w:rPr>
+      </w:pPr>
+    </w:p>
+    <w:p>
+      <w:pPr>
+        <w:pStyle w:val="NoSpacing"/>
+        <w:rPr>
+          <w:rFonts w:ascii="Consolas" w:hAnsi="Consolas"/>
+          <w:sz w:val="19"/>
+        </w:rPr>
+      </w:pPr>
+      <w:r>
+        <w:rPr>
+          <w:rFonts w:ascii="Consolas" w:hAnsi="Consolas"/>
+          <w:sz w:val="19"/>
+        </w:rPr>
+        <w:t xml:space="preserve">            // Build and start the tracer process</w:t>
+      </w:r>
+    </w:p>
+    <w:p>
+      <w:pPr>
+        <w:pStyle w:val="NoSpacing"/>
+        <w:rPr>
+          <w:rFonts w:ascii="Consolas" w:hAnsi="Consolas"/>
+          <w:sz w:val="19"/>
+        </w:rPr>
+      </w:pPr>
+      <w:r>
+        <w:rPr>
+          <w:rFonts w:ascii="Consolas" w:hAnsi="Consolas"/>
+          <w:sz w:val="19"/>
+        </w:rPr>
+        <w:t xml:space="preserve">            using TracerProvider tracerProvider = traceBuilder.Build();</w:t>
+      </w:r>
+    </w:p>
+    <w:p>
+      <w:pPr>
+        <w:pStyle w:val="NoSpacing"/>
+        <w:rPr>
+          <w:rFonts w:ascii="Consolas" w:hAnsi="Consolas"/>
+          <w:sz w:val="19"/>
+        </w:rPr>
+      </w:pPr>
+    </w:p>
+    <w:p>
+      <w:pPr>
+        <w:pStyle w:val="NoSpacing"/>
+        <w:rPr>
+          <w:rFonts w:ascii="Consolas" w:hAnsi="Consolas"/>
+          <w:sz w:val="19"/>
+        </w:rPr>
+      </w:pPr>
+      <w:r>
+        <w:rPr>
+          <w:rFonts w:ascii="Consolas" w:hAnsi="Consolas"/>
+          <w:sz w:val="19"/>
+        </w:rPr>
+        <w:t xml:space="preserve">            // 2. Initialize the Kernel</w:t>
+      </w:r>
+    </w:p>
+    <w:p>
+      <w:pPr>
+        <w:pStyle w:val="NoSpacing"/>
+        <w:rPr>
+          <w:rFonts w:ascii="Consolas" w:hAnsi="Consolas"/>
+          <w:sz w:val="19"/>
+        </w:rPr>
+      </w:pPr>
+      <w:r>
+        <w:rPr>
+          <w:rFonts w:ascii="Consolas" w:hAnsi="Consolas"/>
+          <w:sz w:val="19"/>
+        </w:rPr>
+        <w:t xml:space="preserve">            IKernelBuilder builder = Kernel.CreateBuilder();</w:t>
+      </w:r>
+    </w:p>
+    <w:p>
+      <w:pPr>
+        <w:pStyle w:val="NoSpacing"/>
+        <w:rPr>
+          <w:rFonts w:ascii="Consolas" w:hAnsi="Consolas"/>
+          <w:sz w:val="19"/>
+        </w:rPr>
+      </w:pPr>
+    </w:p>
+    <w:p>
+      <w:pPr>
+        <w:pStyle w:val="NoSpacing"/>
+        <w:rPr>
+          <w:rFonts w:ascii="Consolas" w:hAnsi="Consolas"/>
+          <w:sz w:val="19"/>
+        </w:rPr>
+      </w:pPr>
+      <w:r>
+        <w:rPr>
+          <w:rFonts w:ascii="Consolas" w:hAnsi="Consolas"/>
+          <w:sz w:val="19"/>
+        </w:rPr>
+        <w:t xml:space="preserve">            string apiKey = Environment.GetEnvironmentVariable("GEMINI_API_KEY")</w:t>
+      </w:r>
+    </w:p>
+    <w:p>
+      <w:pPr>
+        <w:pStyle w:val="NoSpacing"/>
+        <w:rPr>
+          <w:rFonts w:ascii="Consolas" w:hAnsi="Consolas"/>
+          <w:sz w:val="19"/>
+        </w:rPr>
+      </w:pPr>
+      <w:r>
+        <w:rPr>
+          <w:rFonts w:ascii="Consolas" w:hAnsi="Consolas"/>
+          <w:sz w:val="19"/>
+        </w:rPr>
+        <w:t xml:space="preserve">                ?? throw new Exception("GEMINI_API_KEY is missing");</w:t>
+      </w:r>
+    </w:p>
+    <w:p>
+      <w:pPr>
+        <w:pStyle w:val="NoSpacing"/>
+        <w:rPr>
+          <w:rFonts w:ascii="Consolas" w:hAnsi="Consolas"/>
+          <w:sz w:val="19"/>
+        </w:rPr>
+      </w:pPr>
+    </w:p>
+    <w:p>
+      <w:pPr>
+        <w:pStyle w:val="NoSpacing"/>
+        <w:rPr>
+          <w:rFonts w:ascii="Consolas" w:hAnsi="Consolas"/>
+          <w:sz w:val="19"/>
+        </w:rPr>
+      </w:pPr>
+      <w:r>
+        <w:rPr>
+          <w:rFonts w:ascii="Consolas" w:hAnsi="Consolas"/>
+          <w:sz w:val="19"/>
+        </w:rPr>
+        <w:t xml:space="preserve">            builder.AddGoogleAIGeminiChatCompletion("gemini-2.5-flash", apiKey);</w:t>
+      </w:r>
+    </w:p>
+    <w:p>
+      <w:pPr>
+        <w:pStyle w:val="NoSpacing"/>
+        <w:rPr>
+          <w:rFonts w:ascii="Consolas" w:hAnsi="Consolas"/>
+          <w:sz w:val="19"/>
+        </w:rPr>
+      </w:pPr>
+    </w:p>
+    <w:p>
+      <w:pPr>
+        <w:pStyle w:val="NoSpacing"/>
+        <w:rPr>
+          <w:rFonts w:ascii="Consolas" w:hAnsi="Consolas"/>
+          <w:sz w:val="19"/>
+        </w:rPr>
+      </w:pPr>
+      <w:r>
+        <w:rPr>
+          <w:rFonts w:ascii="Consolas" w:hAnsi="Consolas"/>
+          <w:sz w:val="19"/>
+        </w:rPr>
+        <w:t xml:space="preserve">            // Register our mock plugin</w:t>
+      </w:r>
+    </w:p>
+    <w:p>
+      <w:pPr>
+        <w:pStyle w:val="NoSpacing"/>
+        <w:rPr>
+          <w:rFonts w:ascii="Consolas" w:hAnsi="Consolas"/>
+          <w:sz w:val="19"/>
+        </w:rPr>
+      </w:pPr>
+      <w:r>
+        <w:rPr>
+          <w:rFonts w:ascii="Consolas" w:hAnsi="Consolas"/>
+          <w:sz w:val="19"/>
+        </w:rPr>
+        <w:t xml:space="preserve">            builder.Plugins.AddFromType&lt;SlowWeatherPlugin&gt;();</w:t>
+      </w:r>
+    </w:p>
+    <w:p>
+      <w:pPr>
+        <w:pStyle w:val="NoSpacing"/>
+        <w:rPr>
+          <w:rFonts w:ascii="Consolas" w:hAnsi="Consolas"/>
+          <w:sz w:val="19"/>
+        </w:rPr>
+      </w:pPr>
+    </w:p>
+    <w:p>
+      <w:pPr>
+        <w:pStyle w:val="NoSpacing"/>
+        <w:rPr>
+          <w:rFonts w:ascii="Consolas" w:hAnsi="Consolas"/>
+          <w:sz w:val="19"/>
+        </w:rPr>
+      </w:pPr>
+      <w:r>
+        <w:rPr>
+          <w:rFonts w:ascii="Consolas" w:hAnsi="Consolas"/>
+          <w:sz w:val="19"/>
+        </w:rPr>
+        <w:t xml:space="preserve">            Kernel kernel = builder.Build();</w:t>
+      </w:r>
+    </w:p>
+    <w:p>
+      <w:pPr>
+        <w:pStyle w:val="NoSpacing"/>
+        <w:rPr>
+          <w:rFonts w:ascii="Consolas" w:hAnsi="Consolas"/>
+          <w:sz w:val="19"/>
+        </w:rPr>
+      </w:pPr>
+    </w:p>
+    <w:p>
+      <w:pPr>
+        <w:pStyle w:val="NoSpacing"/>
+        <w:rPr>
+          <w:rFonts w:ascii="Consolas" w:hAnsi="Consolas"/>
+          <w:sz w:val="19"/>
+        </w:rPr>
+      </w:pPr>
+      <w:r>
+        <w:rPr>
+          <w:rFonts w:ascii="Consolas" w:hAnsi="Consolas"/>
+          <w:sz w:val="19"/>
+        </w:rPr>
+        <w:t xml:space="preserve">            Console.WriteLine("Starting observability session...\n");</w:t>
+      </w:r>
+    </w:p>
+    <w:p>
+      <w:pPr>
+        <w:pStyle w:val="NoSpacing"/>
+        <w:rPr>
+          <w:rFonts w:ascii="Consolas" w:hAnsi="Consolas"/>
+          <w:sz w:val="19"/>
+        </w:rPr>
+      </w:pPr>
+    </w:p>
+    <w:p>
+      <w:pPr>
+        <w:pStyle w:val="NoSpacing"/>
+        <w:rPr>
+          <w:rFonts w:ascii="Consolas" w:hAnsi="Consolas"/>
+          <w:sz w:val="19"/>
+        </w:rPr>
+      </w:pPr>
+      <w:r>
+        <w:rPr>
+          <w:rFonts w:ascii="Consolas" w:hAnsi="Consolas"/>
+          <w:sz w:val="19"/>
+        </w:rPr>
+        <w:t xml:space="preserve">            // 3. Execute a request that requires tool usage</w:t>
+      </w:r>
+    </w:p>
+    <w:p>
+      <w:pPr>
+        <w:pStyle w:val="NoSpacing"/>
+        <w:rPr>
+          <w:rFonts w:ascii="Consolas" w:hAnsi="Consolas"/>
+          <w:sz w:val="19"/>
+        </w:rPr>
+      </w:pPr>
+      <w:r>
+        <w:rPr>
+          <w:rFonts w:ascii="Consolas" w:hAnsi="Consolas"/>
+          <w:sz w:val="19"/>
+        </w:rPr>
+        <w:t xml:space="preserve">            // Be enabling AutoInvoke, Semantic Kernel will automatically handle the tool loop.</w:t>
+      </w:r>
+    </w:p>
+    <w:p>
+      <w:pPr>
+        <w:pStyle w:val="NoSpacing"/>
+        <w:rPr>
+          <w:rFonts w:ascii="Consolas" w:hAnsi="Consolas"/>
+          <w:sz w:val="19"/>
+        </w:rPr>
+      </w:pPr>
+      <w:r>
+        <w:rPr>
+          <w:rFonts w:ascii="Consolas" w:hAnsi="Consolas"/>
+          <w:sz w:val="19"/>
+        </w:rPr>
+        <w:t xml:space="preserve">            // This generates multiple telemetry spans: one for the initial LLM call,</w:t>
+      </w:r>
+    </w:p>
+    <w:p>
+      <w:pPr>
+        <w:pStyle w:val="NoSpacing"/>
+        <w:rPr>
+          <w:rFonts w:ascii="Consolas" w:hAnsi="Consolas"/>
+          <w:sz w:val="19"/>
+        </w:rPr>
+      </w:pPr>
+      <w:r>
+        <w:rPr>
+          <w:rFonts w:ascii="Consolas" w:hAnsi="Consolas"/>
+          <w:sz w:val="19"/>
+        </w:rPr>
+        <w:t xml:space="preserve">            // one for the plugin execution, and one for the final LLM summary.</w:t>
+      </w:r>
+    </w:p>
+    <w:p>
+      <w:pPr>
+        <w:pStyle w:val="NoSpacing"/>
+        <w:rPr>
+          <w:rFonts w:ascii="Consolas" w:hAnsi="Consolas"/>
+          <w:sz w:val="19"/>
+        </w:rPr>
+      </w:pPr>
+      <w:r>
+        <w:rPr>
+          <w:rFonts w:ascii="Consolas" w:hAnsi="Consolas"/>
+          <w:sz w:val="19"/>
+        </w:rPr>
+        <w:t xml:space="preserve">            GeminiPromptExecutionSettings settings = new GeminiPromptExecutionSettings();</w:t>
+      </w:r>
+    </w:p>
+    <w:p>
+      <w:pPr>
+        <w:pStyle w:val="NoSpacing"/>
+        <w:rPr>
+          <w:rFonts w:ascii="Consolas" w:hAnsi="Consolas"/>
+          <w:sz w:val="19"/>
+        </w:rPr>
+      </w:pPr>
+      <w:r>
+        <w:rPr>
+          <w:rFonts w:ascii="Consolas" w:hAnsi="Consolas"/>
+          <w:sz w:val="19"/>
+        </w:rPr>
+        <w:t xml:space="preserve">            settings.ToolCallBehavior = GeminiToolCallBehavior.AutoInvokeKernelFunctions;</w:t>
+      </w:r>
+    </w:p>
+    <w:p>
+      <w:pPr>
+        <w:pStyle w:val="NoSpacing"/>
+        <w:rPr>
+          <w:rFonts w:ascii="Consolas" w:hAnsi="Consolas"/>
+          <w:sz w:val="19"/>
+        </w:rPr>
+      </w:pPr>
+    </w:p>
+    <w:p>
+      <w:pPr>
+        <w:pStyle w:val="NoSpacing"/>
+        <w:rPr>
+          <w:rFonts w:ascii="Consolas" w:hAnsi="Consolas"/>
+          <w:sz w:val="19"/>
+        </w:rPr>
+      </w:pPr>
+      <w:r>
+        <w:rPr>
+          <w:rFonts w:ascii="Consolas" w:hAnsi="Consolas"/>
+          <w:sz w:val="19"/>
+        </w:rPr>
+        <w:t xml:space="preserve">            KernelArguments arguments = new KernelArguments(settings);</w:t>
+      </w:r>
+    </w:p>
+    <w:p>
+      <w:pPr>
+        <w:pStyle w:val="NoSpacing"/>
+        <w:rPr>
+          <w:rFonts w:ascii="Consolas" w:hAnsi="Consolas"/>
+          <w:sz w:val="19"/>
+        </w:rPr>
+      </w:pPr>
+      <w:r>
+        <w:rPr>
+          <w:rFonts w:ascii="Consolas" w:hAnsi="Consolas"/>
+          <w:sz w:val="19"/>
+        </w:rPr>
+        <w:t xml:space="preserve">            string prompt = "What is the weather like in Seattle right now?";</w:t>
+      </w:r>
+    </w:p>
+    <w:p>
+      <w:pPr>
+        <w:pStyle w:val="NoSpacing"/>
+        <w:rPr>
+          <w:rFonts w:ascii="Consolas" w:hAnsi="Consolas"/>
+          <w:sz w:val="19"/>
+        </w:rPr>
+      </w:pPr>
+    </w:p>
+    <w:p>
+      <w:pPr>
+        <w:pStyle w:val="NoSpacing"/>
+        <w:rPr>
+          <w:rFonts w:ascii="Consolas" w:hAnsi="Consolas"/>
+          <w:sz w:val="19"/>
+        </w:rPr>
+      </w:pPr>
+      <w:r>
+        <w:rPr>
+          <w:rFonts w:ascii="Consolas" w:hAnsi="Consolas"/>
+          <w:sz w:val="19"/>
+        </w:rPr>
+        <w:t xml:space="preserve">            Console.WriteLine($"User: {prompt}\n");</w:t>
+      </w:r>
+    </w:p>
+    <w:p>
+      <w:pPr>
+        <w:pStyle w:val="NoSpacing"/>
+        <w:rPr>
+          <w:rFonts w:ascii="Consolas" w:hAnsi="Consolas"/>
+          <w:sz w:val="19"/>
+        </w:rPr>
+      </w:pPr>
+      <w:r>
+        <w:rPr>
+          <w:rFonts w:ascii="Consolas" w:hAnsi="Consolas"/>
+          <w:sz w:val="19"/>
+        </w:rPr>
+        <w:t xml:space="preserve">            Console.WriteLine("--- EXECUTING &amp; TRACING ---");</w:t>
+      </w:r>
+    </w:p>
+    <w:p>
+      <w:pPr>
+        <w:pStyle w:val="NoSpacing"/>
+        <w:rPr>
+          <w:rFonts w:ascii="Consolas" w:hAnsi="Consolas"/>
+          <w:sz w:val="19"/>
+        </w:rPr>
+      </w:pPr>
+    </w:p>
+    <w:p>
+      <w:pPr>
+        <w:pStyle w:val="NoSpacing"/>
+        <w:rPr>
+          <w:rFonts w:ascii="Consolas" w:hAnsi="Consolas"/>
+          <w:sz w:val="19"/>
+        </w:rPr>
+      </w:pPr>
+      <w:r>
+        <w:rPr>
+          <w:rFonts w:ascii="Consolas" w:hAnsi="Consolas"/>
+          <w:sz w:val="19"/>
+        </w:rPr>
+        <w:t xml:space="preserve">            try</w:t>
+      </w:r>
+    </w:p>
+    <w:p>
+      <w:pPr>
+        <w:pStyle w:val="NoSpacing"/>
+        <w:rPr>
+          <w:rFonts w:ascii="Consolas" w:hAnsi="Consolas"/>
+          <w:sz w:val="19"/>
+        </w:rPr>
+      </w:pPr>
+      <w:r>
+        <w:rPr>
+          <w:rFonts w:ascii="Consolas" w:hAnsi="Consolas"/>
+          <w:sz w:val="19"/>
+        </w:rPr>
+        <w:t xml:space="preserve">            {</w:t>
+      </w:r>
+    </w:p>
+    <w:p>
+      <w:pPr>
+        <w:pStyle w:val="NoSpacing"/>
+        <w:rPr>
+          <w:rFonts w:ascii="Consolas" w:hAnsi="Consolas"/>
+          <w:sz w:val="19"/>
+        </w:rPr>
+      </w:pPr>
+      <w:r>
+        <w:rPr>
+          <w:rFonts w:ascii="Consolas" w:hAnsi="Consolas"/>
+          <w:sz w:val="19"/>
+        </w:rPr>
+        <w:t xml:space="preserve">                // The tracer is running</w:t>
+      </w:r>
+      <w:r>
+        <w:rPr>
+          <w:rFonts w:ascii="Consolas" w:hAnsi="Consolas"/>
+          <w:sz w:val="19"/>
+        </w:rPr>
+        <w:t xml:space="preserve"> in the background and will intercept activities here</w:t>
+      </w:r>
+    </w:p>
+    <w:p>
+      <w:pPr>
+        <w:pStyle w:val="NoSpacing"/>
+        <w:rPr>
+          <w:rFonts w:ascii="Consolas" w:hAnsi="Consolas"/>
+          <w:sz w:val="19"/>
+        </w:rPr>
+      </w:pPr>
+      <w:r>
+        <w:rPr>
+          <w:rFonts w:ascii="Consolas" w:hAnsi="Consolas"/>
+          <w:sz w:val="19"/>
+        </w:rPr>
+        <w:t xml:space="preserve">                var result = await kernel.InvokePromptAsync(prompt, arguments);</w:t>
+      </w:r>
+    </w:p>
+    <w:p>
+      <w:pPr>
+        <w:pStyle w:val="NoSpacing"/>
+        <w:rPr>
+          <w:rFonts w:ascii="Consolas" w:hAnsi="Consolas"/>
+          <w:sz w:val="19"/>
+        </w:rPr>
+      </w:pPr>
+    </w:p>
+    <w:p>
+      <w:pPr>
+        <w:pStyle w:val="NoSpacing"/>
+        <w:rPr>
+          <w:rFonts w:ascii="Consolas" w:hAnsi="Consolas"/>
+          <w:sz w:val="19"/>
+        </w:rPr>
+      </w:pPr>
+      <w:r>
+        <w:rPr>
+          <w:rFonts w:ascii="Consolas" w:hAnsi="Consolas"/>
+          <w:sz w:val="19"/>
+        </w:rPr>
+        <w:t xml:space="preserve">                Console.WriteLine($"\nFinal AI Output: {result}");</w:t>
+      </w:r>
+    </w:p>
+    <w:p>
+      <w:pPr>
+        <w:pStyle w:val="NoSpacing"/>
+        <w:rPr>
+          <w:rFonts w:ascii="Consolas" w:hAnsi="Consolas"/>
+          <w:sz w:val="19"/>
+        </w:rPr>
+      </w:pPr>
+      <w:r>
+        <w:rPr>
+          <w:rFonts w:ascii="Consolas" w:hAnsi="Consolas"/>
+          <w:sz w:val="19"/>
+        </w:rPr>
+        <w:t xml:space="preserve">            }</w:t>
+      </w:r>
+    </w:p>
+    <w:p>
+      <w:pPr>
+        <w:pStyle w:val="NoSpacing"/>
+        <w:rPr>
+          <w:rFonts w:ascii="Consolas" w:hAnsi="Consolas"/>
+          <w:sz w:val="19"/>
+        </w:rPr>
+      </w:pPr>
       <w:r>
         <w:rPr>
           <w:rFonts w:ascii="Consolas" w:hAnsi="Consolas"/>
           <w:sz w:val="19"/>
         </w:rPr>
         <w:lastRenderedPageBreak/>
-        <w:t xml:space="preserve"> plugin</w:t>
-      </w:r>
-    </w:p>
-    <w:p>
-      <w:pPr>
-        <w:pStyle w:val="NoSpacing"/>
-        <w:rPr>
-          <w:rFonts w:ascii="Consolas" w:hAnsi="Consolas"/>
-          <w:sz w:val="19"/>
-        </w:rPr>
-      </w:pPr>
-      <w:r>
-        <w:rPr>
-          <w:rFonts w:ascii="Consolas" w:hAnsi="Consolas"/>
-          <w:sz w:val="19"/>
-        </w:rPr>
-        <w:t>// execution shows up as a traced span with real durations.</w:t>
-      </w:r>
-    </w:p>
-    <w:p>
-      <w:pPr>
-        <w:pStyle w:val="NoSpacing"/>
-        <w:rPr>
-          <w:rFonts w:ascii="Consolas" w:hAnsi="Consolas"/>
-          <w:sz w:val="19"/>
-        </w:rPr>
-      </w:pPr>
-      <w:r>
-        <w:rPr>
-          <w:rFonts w:ascii="Consolas" w:hAnsi="Consolas"/>
-          <w:sz w:val="19"/>
-        </w:rPr>
-        <w:t>// SlowWeatherPlugin's artificial delay makes the tool-execution span clearly</w:t>
-      </w:r>
-    </w:p>
-    <w:p>
-      <w:pPr>
-        <w:pStyle w:val="NoSpacing"/>
-        <w:rPr>
-          <w:rFonts w:ascii="Consolas" w:hAnsi="Consolas"/>
-          <w:sz w:val="19"/>
-        </w:rPr>
-      </w:pPr>
-      <w:r>
-        <w:rPr>
-          <w:rFonts w:ascii="Consolas" w:hAnsi="Consolas"/>
-          <w:sz w:val="19"/>
-        </w:rPr>
-        <w:t>// distinct from the surrounding LLM-call spans in the console output. This</w:t>
-      </w:r>
-    </w:p>
-    <w:p>
-      <w:pPr>
-        <w:pStyle w:val="NoSpacing"/>
-        <w:rPr>
-          <w:rFonts w:ascii="Consolas" w:hAnsi="Consolas"/>
-          <w:sz w:val="19"/>
-        </w:rPr>
-      </w:pPr>
-      <w:r>
-        <w:rPr>
-          <w:rFonts w:ascii="Consolas" w:hAnsi="Consolas"/>
-          <w:sz w:val="19"/>
-        </w:rPr>
-        <w:t>// is provider-agnostic by construction - OTel listens to SK's own</w:t>
-      </w:r>
-    </w:p>
-    <w:p>
-      <w:pPr>
-        <w:pStyle w:val="NoSpacing"/>
-        <w:rPr>
-          <w:rFonts w:ascii="Consolas" w:hAnsi="Consolas"/>
-          <w:sz w:val="19"/>
-        </w:rPr>
-      </w:pPr>
-      <w:r>
-        <w:rPr>
-          <w:rFonts w:ascii="Consolas" w:hAnsi="Consolas"/>
-          <w:sz w:val="19"/>
-        </w:rPr>
-        <w:t>// instrumentation, not to Gemini specifically, so the tracing keeps working</w:t>
-      </w:r>
-    </w:p>
-    <w:p>
-      <w:pPr>
-        <w:pStyle w:val="NoSpacing"/>
-        <w:rPr>
-          <w:rFonts w:ascii="Consolas" w:hAnsi="Consolas"/>
-          <w:sz w:val="19"/>
-        </w:rPr>
-      </w:pPr>
-      <w:r>
-        <w:rPr>
-          <w:rFonts w:ascii="Consolas" w:hAnsi="Consolas"/>
-          <w:sz w:val="19"/>
-        </w:rPr>
-        <w:t>// identically no matter which connector is registered below.</w:t>
-      </w:r>
-    </w:p>
-    <w:p>
-      <w:pPr>
-        <w:pStyle w:val="NoSpacing"/>
-        <w:rPr>
-          <w:rFonts w:ascii="Consolas" w:hAnsi="Consolas"/>
-          <w:sz w:val="19"/>
-        </w:rPr>
-      </w:pPr>
-      <w:r>
-        <w:rPr>
-          <w:rFonts w:ascii="Consolas" w:hAnsi="Consolas"/>
-          <w:sz w:val="19"/>
-        </w:rPr>
-        <w:t>using System;</w:t>
-      </w:r>
-    </w:p>
-    <w:p>
-      <w:pPr>
-        <w:pStyle w:val="NoSpacing"/>
-        <w:rPr>
-          <w:rFonts w:ascii="Consolas" w:hAnsi="Consolas"/>
-          <w:sz w:val="19"/>
-        </w:rPr>
-      </w:pPr>
-      <w:r>
-        <w:rPr>
-          <w:rFonts w:ascii="Consolas" w:hAnsi="Consolas"/>
-          <w:sz w:val="19"/>
-        </w:rPr>
-        <w:t>using System.Threading.Tasks;</w:t>
+        <w:t xml:space="preserve">            </w:t>
+      </w:r>
+      <w:r>
+        <w:rPr>
+          <w:rFonts w:ascii="Consolas" w:hAnsi="Consolas"/>
+          <w:sz w:val="19"/>
+        </w:rPr>
+        <w:t>catch (Exception ex)</w:t>
+      </w:r>
+    </w:p>
+    <w:p>
+      <w:pPr>
+        <w:pStyle w:val="NoSpacing"/>
+        <w:rPr>
+          <w:rFonts w:ascii="Consolas" w:hAnsi="Consolas"/>
+          <w:sz w:val="19"/>
+        </w:rPr>
+      </w:pPr>
+      <w:r>
+        <w:rPr>
+          <w:rFonts w:ascii="Consolas" w:hAnsi="Consolas"/>
+          <w:sz w:val="19"/>
+        </w:rPr>
+        <w:t xml:space="preserve">            {</w:t>
+      </w:r>
+    </w:p>
+    <w:p>
+      <w:pPr>
+        <w:pStyle w:val="NoSpacing"/>
+        <w:rPr>
+          <w:rFonts w:ascii="Consolas" w:hAnsi="Consolas"/>
+          <w:sz w:val="19"/>
+        </w:rPr>
+      </w:pPr>
+      <w:r>
+        <w:rPr>
+          <w:rFonts w:ascii="Consolas" w:hAnsi="Consolas"/>
+          <w:sz w:val="19"/>
+        </w:rPr>
+        <w:t xml:space="preserve">                // A dropped</w:t>
+      </w:r>
+      <w:r>
+        <w:rPr>
+          <w:rFonts w:ascii="Consolas" w:hAnsi="Consolas"/>
+          <w:sz w:val="19"/>
+        </w:rPr>
+        <w:t xml:space="preserve"> connection or rejected API call shouldn't crash the</w:t>
+      </w:r>
+    </w:p>
+    <w:p>
+      <w:pPr>
+        <w:pStyle w:val="NoSpacing"/>
+        <w:rPr>
+          <w:rFonts w:ascii="Consolas" w:hAnsi="Consolas"/>
+          <w:sz w:val="19"/>
+        </w:rPr>
+      </w:pPr>
+      <w:r>
+        <w:rPr>
+          <w:rFonts w:ascii="Consolas" w:hAnsi="Consolas"/>
+          <w:sz w:val="19"/>
+        </w:rPr>
+        <w:t xml:space="preserve">                // session with an unhandled exception - and for this lesson it's</w:t>
+      </w:r>
+    </w:p>
+    <w:p>
+      <w:pPr>
+        <w:pStyle w:val="NoSpacing"/>
+        <w:rPr>
+          <w:rFonts w:ascii="Consolas" w:hAnsi="Consolas"/>
+          <w:sz w:val="19"/>
+        </w:rPr>
+      </w:pPr>
+      <w:r>
+        <w:rPr>
+          <w:rFonts w:ascii="Consolas" w:hAnsi="Consolas"/>
+          <w:sz w:val="19"/>
+        </w:rPr>
+        <w:t xml:space="preserve">                // doubly important, since the trace of *how* it failed is exactly</w:t>
+      </w:r>
+    </w:p>
+    <w:p>
+      <w:pPr>
+        <w:pStyle w:val="NoSpacing"/>
+        <w:rPr>
+          <w:rFonts w:ascii="Consolas" w:hAnsi="Consolas"/>
+          <w:sz w:val="19"/>
+        </w:rPr>
+      </w:pPr>
+      <w:r>
+        <w:rPr>
+          <w:rFonts w:ascii="Consolas" w:hAnsi="Consolas"/>
+          <w:sz w:val="19"/>
+        </w:rPr>
+        <w:t xml:space="preserve">                // the kind of thing OTel is here to capture.</w:t>
+      </w:r>
+    </w:p>
+    <w:p>
+      <w:pPr>
+        <w:pStyle w:val="NoSpacing"/>
+        <w:rPr>
+          <w:rFonts w:ascii="Consolas" w:hAnsi="Consolas"/>
+          <w:sz w:val="19"/>
+        </w:rPr>
+      </w:pPr>
+      <w:r>
+        <w:rPr>
+          <w:rFonts w:ascii="Consolas" w:hAnsi="Consolas"/>
+          <w:sz w:val="19"/>
+        </w:rPr>
+        <w:t xml:space="preserve">                Console.WriteLine($"\n[ERROR] The request failed: {ex.Message}");</w:t>
+      </w:r>
+    </w:p>
+    <w:p>
+      <w:pPr>
+        <w:pStyle w:val="NoSpacing"/>
+        <w:rPr>
+          <w:rFonts w:ascii="Consolas" w:hAnsi="Consolas"/>
+          <w:sz w:val="19"/>
+        </w:rPr>
+      </w:pPr>
+      <w:r>
+        <w:rPr>
+          <w:rFonts w:ascii="Consolas" w:hAnsi="Consolas"/>
+          <w:sz w:val="19"/>
+        </w:rPr>
+        <w:t xml:space="preserve">            }</w:t>
+      </w:r>
+    </w:p>
+    <w:p>
+      <w:pPr>
+        <w:pStyle w:val="NoSpacing"/>
+        <w:rPr>
+          <w:rFonts w:ascii="Consolas" w:hAnsi="Consolas"/>
+          <w:sz w:val="19"/>
+        </w:rPr>
+      </w:pPr>
+      <w:r>
+        <w:rPr>
+          <w:rFonts w:ascii="Consolas" w:hAnsi="Consolas"/>
+          <w:sz w:val="19"/>
+        </w:rPr>
+        <w:t xml:space="preserve">            finally</w:t>
+      </w:r>
+    </w:p>
+    <w:p>
+      <w:pPr>
+        <w:pStyle w:val="NoSpacing"/>
+        <w:rPr>
+          <w:rFonts w:ascii="Consolas" w:hAnsi="Consolas"/>
+          <w:sz w:val="19"/>
+        </w:rPr>
+      </w:pPr>
+      <w:r>
+        <w:rPr>
+          <w:rFonts w:ascii="Consolas" w:hAnsi="Consolas"/>
+          <w:sz w:val="19"/>
+        </w:rPr>
+        <w:t xml:space="preserve">            {</w:t>
+      </w:r>
+    </w:p>
+    <w:p>
+      <w:pPr>
+        <w:pStyle w:val="NoSpacing"/>
+        <w:rPr>
+          <w:rFonts w:ascii="Consolas" w:hAnsi="Consolas"/>
+          <w:sz w:val="19"/>
+        </w:rPr>
+      </w:pPr>
+      <w:r>
+        <w:rPr>
+          <w:rFonts w:ascii="Consolas" w:hAnsi="Consolas"/>
+          <w:sz w:val="19"/>
+        </w:rPr>
+        <w:t xml:space="preserve">                // Ensure all traces are flushed to the console before the program exits,</w:t>
+      </w:r>
+    </w:p>
+    <w:p>
+      <w:pPr>
+        <w:pStyle w:val="NoSpacing"/>
+        <w:rPr>
+          <w:rFonts w:ascii="Consolas" w:hAnsi="Consolas"/>
+          <w:sz w:val="19"/>
+        </w:rPr>
+      </w:pPr>
+      <w:r>
+        <w:rPr>
+          <w:rFonts w:ascii="Consolas" w:hAnsi="Consolas"/>
+          <w:sz w:val="19"/>
+        </w:rPr>
+        <w:t xml:space="preserve">                // whether the call above succeeded or failed.</w:t>
+      </w:r>
+    </w:p>
+    <w:p>
+      <w:pPr>
+        <w:pStyle w:val="NoSpacing"/>
+        <w:rPr>
+          <w:rFonts w:ascii="Consolas" w:hAnsi="Consolas"/>
+          <w:sz w:val="19"/>
+        </w:rPr>
+      </w:pPr>
+      <w:r>
+        <w:rPr>
+          <w:rFonts w:ascii="Consolas" w:hAnsi="Consolas"/>
+          <w:sz w:val="19"/>
+        </w:rPr>
+        <w:t xml:space="preserve">                tracerProvider.ForceFlush();</w:t>
+      </w:r>
+    </w:p>
+    <w:p>
+      <w:pPr>
+        <w:pStyle w:val="NoSpacing"/>
+        <w:rPr>
+          <w:rFonts w:ascii="Consolas" w:hAnsi="Consolas"/>
+          <w:sz w:val="19"/>
+        </w:rPr>
+      </w:pPr>
+      <w:r>
+        <w:rPr>
+          <w:rFonts w:ascii="Consolas" w:hAnsi="Consolas"/>
+          <w:sz w:val="19"/>
+        </w:rPr>
+        <w:t xml:space="preserve">            }</w:t>
+      </w:r>
+    </w:p>
+    <w:p>
+      <w:pPr>
+        <w:pStyle w:val="NoSpacing"/>
+        <w:rPr>
+          <w:rFonts w:ascii="Consolas" w:hAnsi="Consolas"/>
+          <w:sz w:val="19"/>
+        </w:rPr>
+      </w:pPr>
+    </w:p>
+    <w:p>
+      <w:pPr>
+        <w:pStyle w:val="NoSpacing"/>
+        <w:rPr>
+          <w:rFonts w:ascii="Consolas" w:hAnsi="Consolas"/>
+          <w:sz w:val="19"/>
+        </w:rPr>
+      </w:pPr>
+      <w:r>
+        <w:rPr>
+          <w:rFonts w:ascii="Consolas" w:hAnsi="Consolas"/>
+          <w:sz w:val="19"/>
+        </w:rPr>
+        <w:t xml:space="preserve">            Console.WriteLine("\nSession complete.  Review Open Telemetry traces above.");</w:t>
+      </w:r>
+    </w:p>
+    <w:p>
+      <w:pPr>
+        <w:pStyle w:val="NoSpacing"/>
+        <w:rPr>
+          <w:rFonts w:ascii="Consolas" w:hAnsi="Consolas"/>
+          <w:sz w:val="19"/>
+        </w:rPr>
+      </w:pPr>
+    </w:p>
+    <w:p>
+      <w:pPr>
+        <w:pStyle w:val="NoSpacing"/>
+        <w:rPr>
+          <w:rFonts w:ascii="Consolas" w:hAnsi="Consolas"/>
+          <w:sz w:val="19"/>
+        </w:rPr>
+      </w:pPr>
+      <w:r>
+        <w:rPr>
+          <w:rFonts w:ascii="Consolas" w:hAnsi="Consolas"/>
+          <w:sz w:val="19"/>
+        </w:rPr>
+        <w:t xml:space="preserve">        }</w:t>
+      </w:r>
+    </w:p>
+    <w:p>
+      <w:pPr>
+        <w:pStyle w:val="NoSpacing"/>
+        <w:rPr>
+          <w:rFonts w:ascii="Consolas" w:hAnsi="Consolas"/>
+          <w:sz w:val="19"/>
+        </w:rPr>
+      </w:pPr>
+      <w:r>
+        <w:rPr>
+          <w:rFonts w:ascii="Consolas" w:hAnsi="Consolas"/>
+          <w:sz w:val="19"/>
+        </w:rPr>
+        <w:t xml:space="preserve">    }</w:t>
+      </w:r>
+    </w:p>
+    <w:p>
+      <w:pPr>
+        <w:pStyle w:val="NoSpacing"/>
+        <w:rPr>
+          <w:rFonts w:ascii="Consolas" w:hAnsi="Consolas"/>
+          <w:sz w:val="19"/>
+        </w:rPr>
+      </w:pPr>
+      <w:r>
+        <w:rPr>
+          <w:rFonts w:ascii="Consolas" w:hAnsi="Consolas"/>
+          <w:sz w:val="19"/>
+        </w:rPr>
+        <w:t>}</w:t>
+      </w:r>
+    </w:p>
+    <w:p/>
+    <w:p>
+      <w:pPr>
+        <w:rPr>
+          <w:b/>
+        </w:rPr>
+      </w:pPr>
+      <w:r>
+        <w:rPr>
+          <w:b/>
+        </w:rPr>
+        <w:t>SlowWeatherPlugin.cs</w:t>
+      </w:r>
+    </w:p>
+    <w:p>
+      <w:pPr>
+        <w:pStyle w:val="NoSpacing"/>
+        <w:rPr>
+          <w:rFonts w:ascii="Consolas" w:hAnsi="Consolas"/>
+          <w:sz w:val="19"/>
+        </w:rPr>
+      </w:pPr>
+      <w:r>
+        <w:rPr>
+          <w:rFonts w:ascii="Consolas" w:hAnsi="Consolas"/>
+          <w:sz w:val="19"/>
+        </w:rPr>
+        <w:t>// SlowWeatherPlugin</w:t>
+      </w:r>
+    </w:p>
+    <w:p>
+      <w:pPr>
+        <w:pStyle w:val="NoSpacing"/>
+        <w:rPr>
+          <w:rFonts w:ascii="Consolas" w:hAnsi="Consolas"/>
+          <w:sz w:val="19"/>
+        </w:rPr>
+      </w:pPr>
+      <w:r>
+        <w:rPr>
+          <w:rFonts w:ascii="Consolas" w:hAnsi="Consolas"/>
+          <w:sz w:val="19"/>
+        </w:rPr>
+        <w:t>// ---------------------------------------------------------------------------</w:t>
+      </w:r>
+    </w:p>
+    <w:p>
+      <w:pPr>
+        <w:pStyle w:val="NoSpacing"/>
+        <w:rPr>
+          <w:rFonts w:ascii="Consolas" w:hAnsi="Consolas"/>
+          <w:sz w:val="19"/>
+        </w:rPr>
+      </w:pPr>
+      <w:r>
+        <w:rPr>
+          <w:rFonts w:ascii="Consolas" w:hAnsi="Consolas"/>
+          <w:sz w:val="19"/>
+        </w:rPr>
+        <w:t>// A mock plugin with a deliberate artificial delay, so its telemetry span</w:t>
+      </w:r>
+    </w:p>
+    <w:p>
+      <w:pPr>
+        <w:pStyle w:val="NoSpacing"/>
+        <w:rPr>
+          <w:rFonts w:ascii="Consolas" w:hAnsi="Consolas"/>
+          <w:sz w:val="19"/>
+        </w:rPr>
+      </w:pPr>
+      <w:r>
+        <w:rPr>
+          <w:rFonts w:ascii="Consolas" w:hAnsi="Consolas"/>
+          <w:sz w:val="19"/>
+        </w:rPr>
+        <w:t>// shows up with a clearly distinguishable duration from the surrounding</w:t>
+      </w:r>
+    </w:p>
+    <w:p>
+      <w:pPr>
+        <w:pStyle w:val="NoSpacing"/>
+        <w:rPr>
+          <w:rFonts w:ascii="Consolas" w:hAnsi="Consolas"/>
+          <w:sz w:val="19"/>
+        </w:rPr>
+      </w:pPr>
+      <w:r>
+        <w:rPr>
+          <w:rFonts w:ascii="Consolas" w:hAnsi="Consolas"/>
+          <w:sz w:val="19"/>
+        </w:rPr>
+        <w:t>// model-call spans when viewing the OpenTelemetry trace output.</w:t>
       </w:r>
     </w:p>
     <w:p>
@@ -501,39 +1747,7 @@
           <w:rFonts w:ascii="Consolas" w:hAnsi="Consolas"/>
           <w:sz w:val="19"/>
         </w:rPr>
-        <w:t>using Microsoft.SemanticKernel.Connectors.Google;</w:t>
-      </w:r>
-    </w:p>
-    <w:p>
-      <w:pPr>
-        <w:pStyle w:val="NoSpacing"/>
-        <w:rPr>
-          <w:rFonts w:ascii="Consolas" w:hAnsi="Consolas"/>
-          <w:sz w:val="19"/>
-        </w:rPr>
-      </w:pPr>
-      <w:r>
-        <w:rPr>
-          <w:rFonts w:ascii="Consolas" w:hAnsi="Consolas"/>
-          <w:sz w:val="19"/>
-        </w:rPr>
-        <w:t>using OpenTelemetry;</w:t>
-      </w:r>
-    </w:p>
-    <w:p>
-      <w:pPr>
-        <w:pStyle w:val="NoSpacing"/>
-        <w:rPr>
-          <w:rFonts w:ascii="Consolas" w:hAnsi="Consolas"/>
-          <w:sz w:val="19"/>
-        </w:rPr>
-      </w:pPr>
-      <w:r>
-        <w:rPr>
-          <w:rFonts w:ascii="Consolas" w:hAnsi="Consolas"/>
-          <w:sz w:val="19"/>
-        </w:rPr>
-        <w:t>using OpenTelemetry.Trace;</w:t>
+        <w:t>using System.ComponentModel;</w:t>
       </w:r>
     </w:p>
     <w:p>
@@ -590,7 +1804,7 @@
           <w:rFonts w:ascii="Consolas" w:hAnsi="Consolas"/>
           <w:sz w:val="19"/>
         </w:rPr>
-        <w:t xml:space="preserve">    class Program</w:t>
+        <w:t xml:space="preserve">    internal class SlowWeatherPlugin</w:t>
       </w:r>
     </w:p>
     <w:p>
@@ -622,7 +1836,39 @@
           <w:rFonts w:ascii="Consolas" w:hAnsi="Consolas"/>
           <w:sz w:val="19"/>
         </w:rPr>
-        <w:t xml:space="preserve">        static async Task Main(string[] args)</w:t>
+        <w:t xml:space="preserve">        [KernelFunction("GetWeather")]</w:t>
+      </w:r>
+    </w:p>
+    <w:p>
+      <w:pPr>
+        <w:pStyle w:val="NoSpacing"/>
+        <w:rPr>
+          <w:rFonts w:ascii="Consolas" w:hAnsi="Consolas"/>
+          <w:sz w:val="19"/>
+        </w:rPr>
+      </w:pPr>
+      <w:r>
+        <w:rPr>
+          <w:rFonts w:ascii="Consolas" w:hAnsi="Consolas"/>
+          <w:sz w:val="19"/>
+        </w:rPr>
+        <w:t xml:space="preserve">        [Description("Gets the current weather for a specificy city.")]</w:t>
+      </w:r>
+    </w:p>
+    <w:p>
+      <w:pPr>
+        <w:pStyle w:val="NoSpacing"/>
+        <w:rPr>
+          <w:rFonts w:ascii="Consolas" w:hAnsi="Consolas"/>
+          <w:sz w:val="19"/>
+        </w:rPr>
+      </w:pPr>
+      <w:r>
+        <w:rPr>
+          <w:rFonts w:ascii="Consolas" w:hAnsi="Consolas"/>
+          <w:sz w:val="19"/>
+        </w:rPr>
+        <w:t xml:space="preserve">        public async Task&lt;string&gt; GetWeatherAsync([Description("The city name")] string city)</w:t>
       </w:r>
     </w:p>
     <w:p>
@@ -654,1171 +1900,161 @@
           <w:rFonts w:ascii="Consolas" w:hAnsi="Consolas"/>
           <w:sz w:val="19"/>
         </w:rPr>
-        <w:t xml:space="preserve">            // 1. Configure OpenTelemetry Tracing</w:t>
-      </w:r>
-    </w:p>
-    <w:p>
-      <w:pPr>
-        <w:pStyle w:val="NoSpacing"/>
-        <w:rPr>
-          <w:rFonts w:ascii="Consolas" w:hAnsi="Consolas"/>
-          <w:sz w:val="19"/>
-        </w:rPr>
-      </w:pPr>
-      <w:r>
-        <w:rPr>
-          <w:rFonts w:ascii="Consolas" w:hAnsi="Consolas"/>
-          <w:sz w:val="19"/>
-        </w:rPr>
-        <w:t xml:space="preserve">            // We use explicit lines rather than fluent chaining for clarity.</w:t>
-      </w:r>
-    </w:p>
-    <w:p>
-      <w:pPr>
-        <w:pStyle w:val="NoSpacing"/>
-        <w:rPr>
-          <w:rFonts w:ascii="Consolas" w:hAnsi="Consolas"/>
-          <w:sz w:val="19"/>
-        </w:rPr>
-      </w:pPr>
-      <w:r>
-        <w:rPr>
-          <w:rFonts w:ascii="Consolas" w:hAnsi="Consolas"/>
-          <w:sz w:val="19"/>
-        </w:rPr>
-        <w:t xml:space="preserve">            TracerProviderBuilder traceBuilder = Sdk.CreateTracerProviderBuilder();</w:t>
-      </w:r>
-    </w:p>
-    <w:p>
-      <w:pPr>
-        <w:pStyle w:val="NoSpacing"/>
-        <w:rPr>
-          <w:rFonts w:ascii="Consolas" w:hAnsi="Consolas"/>
-          <w:sz w:val="19"/>
-        </w:rPr>
-      </w:pPr>
-    </w:p>
-    <w:p>
-      <w:pPr>
-        <w:pStyle w:val="NoSpacing"/>
-        <w:rPr>
-          <w:rFonts w:ascii="Consolas" w:hAnsi="Consolas"/>
-          <w:sz w:val="19"/>
-        </w:rPr>
-      </w:pPr>
-      <w:r>
-        <w:rPr>
-          <w:rFonts w:ascii="Consolas" w:hAnsi="Consolas"/>
-          <w:sz w:val="19"/>
-        </w:rPr>
-        <w:t xml:space="preserve">            // Tell Open Telemetry to listen to all diagnostic events emitted by Semantic Kernel</w:t>
-      </w:r>
-    </w:p>
-    <w:p>
-      <w:pPr>
-        <w:pStyle w:val="NoSpacing"/>
-        <w:rPr>
-          <w:rFonts w:ascii="Consolas" w:hAnsi="Consolas"/>
-          <w:sz w:val="19"/>
-        </w:rPr>
-      </w:pPr>
-      <w:r>
-        <w:rPr>
-          <w:rFonts w:ascii="Consolas" w:hAnsi="Consolas"/>
-          <w:sz w:val="19"/>
-        </w:rPr>
-        <w:t xml:space="preserve">            traceBuilder.AddSource("Microsoft.SemanticKernel*");</w:t>
-      </w:r>
-    </w:p>
-    <w:p>
-      <w:pPr>
-        <w:pStyle w:val="NoSpacing"/>
-        <w:rPr>
-          <w:rFonts w:ascii="Consolas" w:hAnsi="Consolas"/>
-          <w:sz w:val="19"/>
-        </w:rPr>
-      </w:pPr>
-    </w:p>
-    <w:p>
-      <w:pPr>
-        <w:pStyle w:val="NoSpacing"/>
-        <w:rPr>
-          <w:rFonts w:ascii="Consolas" w:hAnsi="Consolas"/>
-          <w:sz w:val="19"/>
-        </w:rPr>
-      </w:pPr>
-      <w:r>
-        <w:rPr>
-          <w:rFonts w:ascii="Consolas" w:hAnsi="Consolas"/>
-          <w:sz w:val="19"/>
-        </w:rPr>
-        <w:t xml:space="preserve">            // Output the raw trace data directly to our console window for this tutorial</w:t>
-      </w:r>
-    </w:p>
-    <w:p>
-      <w:pPr>
-        <w:pStyle w:val="NoSpacing"/>
-        <w:rPr>
-          <w:rFonts w:ascii="Consolas" w:hAnsi="Consolas"/>
-          <w:sz w:val="19"/>
-        </w:rPr>
-      </w:pPr>
-      <w:r>
-        <w:rPr>
-          <w:rFonts w:ascii="Consolas" w:hAnsi="Consolas"/>
-          <w:sz w:val="19"/>
-        </w:rPr>
-        <w:t xml:space="preserve">            traceBuilder.AddConsoleExporter();</w:t>
-      </w:r>
-    </w:p>
-    <w:p>
-      <w:pPr>
-        <w:pStyle w:val="NoSpacing"/>
-        <w:rPr>
-          <w:rFonts w:ascii="Consolas" w:hAnsi="Consolas"/>
-          <w:sz w:val="19"/>
-        </w:rPr>
-      </w:pPr>
-    </w:p>
-    <w:p>
-      <w:pPr>
-        <w:pStyle w:val="NoSpacing"/>
-        <w:rPr>
-          <w:rFonts w:ascii="Consolas" w:hAnsi="Consolas"/>
-          <w:sz w:val="19"/>
-        </w:rPr>
-      </w:pPr>
-      <w:r>
-        <w:rPr>
-          <w:rFonts w:ascii="Consolas" w:hAnsi="Consolas"/>
-          <w:sz w:val="19"/>
-        </w:rPr>
-        <w:t xml:space="preserve">            // Build and start the tracer process</w:t>
-      </w:r>
-    </w:p>
-    <w:p>
-      <w:pPr>
-        <w:pStyle w:val="NoSpacing"/>
-        <w:rPr>
-          <w:rFonts w:ascii="Consolas" w:hAnsi="Consolas"/>
-          <w:sz w:val="19"/>
-        </w:rPr>
-      </w:pPr>
-      <w:r>
-        <w:rPr>
-          <w:rFonts w:ascii="Consolas" w:hAnsi="Consolas"/>
-          <w:sz w:val="19"/>
-        </w:rPr>
-        <w:t xml:space="preserve">            using TracerProv</w:t>
-      </w:r>
-      <w:r>
-        <w:rPr>
-          <w:rFonts w:ascii="Consolas" w:hAnsi="Consolas"/>
-          <w:sz w:val="19"/>
+        <w:t xml:space="preserve">            // Simulate network latency (e.g. reaching out to a weather REST API)</w:t>
+      </w:r>
+    </w:p>
+    <w:p>
+      <w:pPr>
+        <w:pStyle w:val="NoSpacing"/>
+        <w:rPr>
+          <w:rFonts w:ascii="Consolas" w:hAnsi="Consolas"/>
+          <w:sz w:val="19"/>
+        </w:rPr>
+      </w:pPr>
+      <w:r>
+        <w:rPr>
+          <w:rFonts w:ascii="Consolas" w:hAnsi="Consolas"/>
+          <w:sz w:val="19"/>
+        </w:rPr>
+        <w:t xml:space="preserve">            await Task.Delay(800);</w:t>
+      </w:r>
+    </w:p>
+    <w:p>
+      <w:pPr>
+        <w:pStyle w:val="NoSpacing"/>
+        <w:rPr>
+          <w:rFonts w:ascii="Consolas" w:hAnsi="Consolas"/>
+          <w:sz w:val="19"/>
+        </w:rPr>
+      </w:pPr>
+      <w:r>
+        <w:rPr>
+          <w:rFonts w:ascii="Consolas" w:hAnsi="Consolas"/>
+          <w:sz w:val="19"/>
+        </w:rPr>
+        <w:t xml:space="preserve">            return $"The weather in {city} is currenlty 72°F and sunny.";</w:t>
+      </w:r>
+    </w:p>
+    <w:p>
+      <w:pPr>
+        <w:pStyle w:val="NoSpacing"/>
+        <w:rPr>
+          <w:rFonts w:ascii="Consolas" w:hAnsi="Consolas"/>
+          <w:sz w:val="19"/>
+        </w:rPr>
+      </w:pPr>
+      <w:r>
+        <w:rPr>
+          <w:rFonts w:ascii="Consolas" w:hAnsi="Consolas"/>
+          <w:sz w:val="19"/>
+        </w:rPr>
+        <w:t xml:space="preserve">        }</w:t>
+      </w:r>
+    </w:p>
+    <w:p>
+      <w:pPr>
+        <w:pStyle w:val="NoSpacing"/>
+        <w:rPr>
+          <w:rFonts w:ascii="Consolas" w:hAnsi="Consolas"/>
+          <w:sz w:val="19"/>
+        </w:rPr>
+      </w:pPr>
+      <w:r>
+        <w:rPr>
+          <w:rFonts w:ascii="Consolas" w:hAnsi="Consolas"/>
+          <w:sz w:val="19"/>
+        </w:rPr>
+        <w:t xml:space="preserve">    }</w:t>
+      </w:r>
+    </w:p>
+    <w:p>
+      <w:pPr>
+        <w:pStyle w:val="NoSpacing"/>
+        <w:rPr>
+          <w:rFonts w:ascii="Consolas" w:hAnsi="Consolas"/>
+          <w:sz w:val="19"/>
+        </w:rPr>
+      </w:pPr>
+      <w:r>
+        <w:rPr>
+          <w:rFonts w:ascii="Consolas" w:hAnsi="Consolas"/>
+          <w:sz w:val="19"/>
+        </w:rPr>
+        <w:t>}</w:t>
+      </w:r>
+    </w:p>
+    <w:p/>
+    <w:p>
+      <w:pPr>
+        <w:pStyle w:val="Heading2"/>
+      </w:pPr>
+      <w:r>
+        <w:t>5. Code Walkthrough &amp; Explanations</w:t>
+      </w:r>
+    </w:p>
+    <w:p/>
+    <w:p>
+      <w:r>
+        <w:rPr>
+          <w:b/>
         </w:rPr>
         <w:lastRenderedPageBreak/>
-        <w:t>ider tracerProvider = traceBuilder.Build();</w:t>
-      </w:r>
-    </w:p>
-    <w:p>
-      <w:pPr>
-        <w:pStyle w:val="NoSpacing"/>
-        <w:rPr>
-          <w:rFonts w:ascii="Consolas" w:hAnsi="Consolas"/>
-          <w:sz w:val="19"/>
-        </w:rPr>
-      </w:pPr>
-    </w:p>
-    <w:p>
-      <w:pPr>
-        <w:pStyle w:val="NoSpacing"/>
-        <w:rPr>
-          <w:rFonts w:ascii="Consolas" w:hAnsi="Consolas"/>
-          <w:sz w:val="19"/>
-        </w:rPr>
-      </w:pPr>
-      <w:r>
-        <w:rPr>
-          <w:rFonts w:ascii="Consolas" w:hAnsi="Consolas"/>
-          <w:sz w:val="19"/>
-        </w:rPr>
-        <w:t xml:space="preserve">            // 2. Initialize the Kernel</w:t>
-      </w:r>
-    </w:p>
-    <w:p>
-      <w:pPr>
-        <w:pStyle w:val="NoSpacing"/>
-        <w:rPr>
-          <w:rFonts w:ascii="Consolas" w:hAnsi="Consolas"/>
-          <w:sz w:val="19"/>
-        </w:rPr>
-      </w:pPr>
-      <w:r>
-        <w:rPr>
-          <w:rFonts w:ascii="Consolas" w:hAnsi="Consolas"/>
-          <w:sz w:val="19"/>
-        </w:rPr>
-        <w:t xml:space="preserve">            IKernelBuilder builder = Kernel.CreateBuilder();</w:t>
-      </w:r>
-    </w:p>
-    <w:p>
-      <w:pPr>
-        <w:pStyle w:val="NoSpacing"/>
-        <w:rPr>
-          <w:rFonts w:ascii="Consolas" w:hAnsi="Consolas"/>
-          <w:sz w:val="19"/>
-        </w:rPr>
-      </w:pPr>
-    </w:p>
-    <w:p>
-      <w:pPr>
-        <w:pStyle w:val="NoSpacing"/>
-        <w:rPr>
-          <w:rFonts w:ascii="Consolas" w:hAnsi="Consolas"/>
-          <w:sz w:val="19"/>
-        </w:rPr>
-      </w:pPr>
-      <w:r>
-        <w:rPr>
-          <w:rFonts w:ascii="Consolas" w:hAnsi="Consolas"/>
-          <w:sz w:val="19"/>
-        </w:rPr>
-        <w:t xml:space="preserve">            string apiKey = Environment.GetEnvironmentVariable("GEMINI_API_KEY")</w:t>
-      </w:r>
-    </w:p>
-    <w:p>
-      <w:pPr>
-        <w:pStyle w:val="NoSpacing"/>
-        <w:rPr>
-          <w:rFonts w:ascii="Consolas" w:hAnsi="Consolas"/>
-          <w:sz w:val="19"/>
-        </w:rPr>
-      </w:pPr>
-      <w:r>
-        <w:rPr>
-          <w:rFonts w:ascii="Consolas" w:hAnsi="Consolas"/>
-          <w:sz w:val="19"/>
-        </w:rPr>
-        <w:t xml:space="preserve">                ?? throw new Exception("GEMINI_API_KEY is missing");</w:t>
-      </w:r>
-    </w:p>
-    <w:p>
-      <w:pPr>
-        <w:pStyle w:val="NoSpacing"/>
-        <w:rPr>
-          <w:rFonts w:ascii="Consolas" w:hAnsi="Consolas"/>
-          <w:sz w:val="19"/>
-        </w:rPr>
-      </w:pPr>
-    </w:p>
-    <w:p>
-      <w:pPr>
-        <w:pStyle w:val="NoSpacing"/>
-        <w:rPr>
-          <w:rFonts w:ascii="Consolas" w:hAnsi="Consolas"/>
-          <w:sz w:val="19"/>
-        </w:rPr>
-      </w:pPr>
-      <w:r>
-        <w:rPr>
-          <w:rFonts w:ascii="Consolas" w:hAnsi="Consolas"/>
-          <w:sz w:val="19"/>
-        </w:rPr>
-        <w:t xml:space="preserve">            builder.AddGoogleAIGeminiChatCompletion("gemini-2.5-flash", apiKey);</w:t>
-      </w:r>
-    </w:p>
-    <w:p>
-      <w:pPr>
-        <w:pStyle w:val="NoSpacing"/>
-        <w:rPr>
-          <w:rFonts w:ascii="Consolas" w:hAnsi="Consolas"/>
-          <w:sz w:val="19"/>
-        </w:rPr>
-      </w:pPr>
-    </w:p>
-    <w:p>
-      <w:pPr>
-        <w:pStyle w:val="NoSpacing"/>
-        <w:rPr>
-          <w:rFonts w:ascii="Consolas" w:hAnsi="Consolas"/>
-          <w:sz w:val="19"/>
-        </w:rPr>
-      </w:pPr>
-      <w:r>
-        <w:rPr>
-          <w:rFonts w:ascii="Consolas" w:hAnsi="Consolas"/>
-          <w:sz w:val="19"/>
-        </w:rPr>
-        <w:t xml:space="preserve">            // Register our mock plugin</w:t>
-      </w:r>
-    </w:p>
-    <w:p>
-      <w:pPr>
-        <w:pStyle w:val="NoSpacing"/>
-        <w:rPr>
-          <w:rFonts w:ascii="Consolas" w:hAnsi="Consolas"/>
-          <w:sz w:val="19"/>
-        </w:rPr>
-      </w:pPr>
-      <w:r>
-        <w:rPr>
-          <w:rFonts w:ascii="Consolas" w:hAnsi="Consolas"/>
-          <w:sz w:val="19"/>
-        </w:rPr>
-        <w:t xml:space="preserve">            builder.Plugins.AddFromType&lt;SlowWeatherPlugin&gt;();</w:t>
-      </w:r>
-    </w:p>
-    <w:p>
-      <w:pPr>
-        <w:pStyle w:val="NoSpacing"/>
-        <w:rPr>
-          <w:rFonts w:ascii="Consolas" w:hAnsi="Consolas"/>
-          <w:sz w:val="19"/>
-        </w:rPr>
-      </w:pPr>
-    </w:p>
-    <w:p>
-      <w:pPr>
-        <w:pStyle w:val="NoSpacing"/>
-        <w:rPr>
-          <w:rFonts w:ascii="Consolas" w:hAnsi="Consolas"/>
-          <w:sz w:val="19"/>
-        </w:rPr>
-      </w:pPr>
-      <w:r>
-        <w:rPr>
-          <w:rFonts w:ascii="Consolas" w:hAnsi="Consolas"/>
-          <w:sz w:val="19"/>
-        </w:rPr>
-        <w:t xml:space="preserve">            Kernel kernel = builder.Build();</w:t>
-      </w:r>
-    </w:p>
-    <w:p>
-      <w:pPr>
-        <w:pStyle w:val="NoSpacing"/>
-        <w:rPr>
-          <w:rFonts w:ascii="Consolas" w:hAnsi="Consolas"/>
-          <w:sz w:val="19"/>
-        </w:rPr>
-      </w:pPr>
-    </w:p>
-    <w:p>
-      <w:pPr>
-        <w:pStyle w:val="NoSpacing"/>
-        <w:rPr>
-          <w:rFonts w:ascii="Consolas" w:hAnsi="Consolas"/>
-          <w:sz w:val="19"/>
-        </w:rPr>
-      </w:pPr>
-      <w:r>
-        <w:rPr>
-          <w:rFonts w:ascii="Consolas" w:hAnsi="Consolas"/>
-          <w:sz w:val="19"/>
-        </w:rPr>
-        <w:t xml:space="preserve">            Console.WriteLine("Starting observability session...\n");</w:t>
-      </w:r>
-    </w:p>
-    <w:p>
-      <w:pPr>
-        <w:pStyle w:val="NoSpacing"/>
-        <w:rPr>
-          <w:rFonts w:ascii="Consolas" w:hAnsi="Consolas"/>
-          <w:sz w:val="19"/>
-        </w:rPr>
-      </w:pPr>
-    </w:p>
-    <w:p>
-      <w:pPr>
-        <w:pStyle w:val="NoSpacing"/>
-        <w:rPr>
-          <w:rFonts w:ascii="Consolas" w:hAnsi="Consolas"/>
-          <w:sz w:val="19"/>
-        </w:rPr>
-      </w:pPr>
-      <w:r>
-        <w:rPr>
-          <w:rFonts w:ascii="Consolas" w:hAnsi="Consolas"/>
-          <w:sz w:val="19"/>
-        </w:rPr>
-        <w:t xml:space="preserve">            // 3. Execute a request that requires tool usage</w:t>
-      </w:r>
-    </w:p>
-    <w:p>
-      <w:pPr>
-        <w:pStyle w:val="NoSpacing"/>
-        <w:rPr>
-          <w:rFonts w:ascii="Consolas" w:hAnsi="Consolas"/>
-          <w:sz w:val="19"/>
-        </w:rPr>
-      </w:pPr>
-      <w:r>
-        <w:rPr>
-          <w:rFonts w:ascii="Consolas" w:hAnsi="Consolas"/>
-          <w:sz w:val="19"/>
-        </w:rPr>
-        <w:t xml:space="preserve">            // Be enabling AutoInvoke, Semantic Kernel will automatically handle the tool loop.</w:t>
-      </w:r>
-    </w:p>
-    <w:p>
-      <w:pPr>
-        <w:pStyle w:val="NoSpacing"/>
-        <w:rPr>
-          <w:rFonts w:ascii="Consolas" w:hAnsi="Consolas"/>
-          <w:sz w:val="19"/>
-        </w:rPr>
-      </w:pPr>
-      <w:r>
-        <w:rPr>
-          <w:rFonts w:ascii="Consolas" w:hAnsi="Consolas"/>
-          <w:sz w:val="19"/>
-        </w:rPr>
-        <w:t xml:space="preserve">            // This generates multiple telemetry spans: one for the initial LLM call,</w:t>
-      </w:r>
-    </w:p>
-    <w:p>
-      <w:pPr>
-        <w:pStyle w:val="NoSpacing"/>
-        <w:rPr>
-          <w:rFonts w:ascii="Consolas" w:hAnsi="Consolas"/>
-          <w:sz w:val="19"/>
-        </w:rPr>
-      </w:pPr>
-      <w:r>
-        <w:rPr>
-          <w:rFonts w:ascii="Consolas" w:hAnsi="Consolas"/>
-          <w:sz w:val="19"/>
-        </w:rPr>
-        <w:t xml:space="preserve">            // one for the plugin execution, and one for the final LLM summary.</w:t>
-      </w:r>
-    </w:p>
-    <w:p>
-      <w:pPr>
-        <w:pStyle w:val="NoSpacing"/>
-        <w:rPr>
-          <w:rFonts w:ascii="Consolas" w:hAnsi="Consolas"/>
-          <w:sz w:val="19"/>
-        </w:rPr>
-      </w:pPr>
-      <w:r>
-        <w:rPr>
-          <w:rFonts w:ascii="Consolas" w:hAnsi="Consolas"/>
-          <w:sz w:val="19"/>
-        </w:rPr>
-        <w:t xml:space="preserve">            GeminiPromptExecutionSettings settings = new GeminiPromptExecutionSettings();</w:t>
-      </w:r>
-    </w:p>
-    <w:p>
-      <w:pPr>
-        <w:pStyle w:val="NoSpacing"/>
-        <w:rPr>
-          <w:rFonts w:ascii="Consolas" w:hAnsi="Consolas"/>
-          <w:sz w:val="19"/>
-        </w:rPr>
-      </w:pPr>
-      <w:r>
-        <w:rPr>
-          <w:rFonts w:ascii="Consolas" w:hAnsi="Consolas"/>
-          <w:sz w:val="19"/>
-        </w:rPr>
-        <w:t xml:space="preserve">            settings.ToolCallBehavior = GeminiToolCallBehavior.AutoInvokeKernelFunctions;</w:t>
-      </w:r>
-    </w:p>
-    <w:p>
-      <w:pPr>
-        <w:pStyle w:val="NoSpacing"/>
-        <w:rPr>
-          <w:rFonts w:ascii="Consolas" w:hAnsi="Consolas"/>
-          <w:sz w:val="19"/>
-        </w:rPr>
-      </w:pPr>
-    </w:p>
-    <w:p>
-      <w:pPr>
-        <w:pStyle w:val="NoSpacing"/>
-        <w:rPr>
-          <w:rFonts w:ascii="Consolas" w:hAnsi="Consolas"/>
-          <w:sz w:val="19"/>
-        </w:rPr>
-      </w:pPr>
-      <w:r>
-        <w:rPr>
-          <w:rFonts w:ascii="Consolas" w:hAnsi="Consolas"/>
-          <w:sz w:val="19"/>
-        </w:rPr>
-        <w:t xml:space="preserve">            KernelArguments arguments = new KernelArguments(settings);</w:t>
-      </w:r>
-    </w:p>
-    <w:p>
-      <w:pPr>
-        <w:pStyle w:val="NoSpacing"/>
-        <w:rPr>
-          <w:rFonts w:ascii="Consolas" w:hAnsi="Consolas"/>
-          <w:sz w:val="19"/>
-        </w:rPr>
-      </w:pPr>
-      <w:r>
-        <w:rPr>
-          <w:rFonts w:ascii="Consolas" w:hAnsi="Consolas"/>
-          <w:sz w:val="19"/>
-        </w:rPr>
-        <w:t xml:space="preserve">            string prompt = "What is the weather like in Seattle right now?";</w:t>
-      </w:r>
-    </w:p>
-    <w:p>
-      <w:pPr>
-        <w:pStyle w:val="NoSpacing"/>
-        <w:rPr>
-          <w:rFonts w:ascii="Consolas" w:hAnsi="Consolas"/>
-          <w:sz w:val="19"/>
-        </w:rPr>
-      </w:pPr>
-    </w:p>
-    <w:p>
-      <w:pPr>
-        <w:pStyle w:val="NoSpacing"/>
-        <w:rPr>
-          <w:rFonts w:ascii="Consolas" w:hAnsi="Consolas"/>
-          <w:sz w:val="19"/>
-        </w:rPr>
-      </w:pPr>
-      <w:r>
-        <w:rPr>
-          <w:rFonts w:ascii="Consolas" w:hAnsi="Consolas"/>
-          <w:sz w:val="19"/>
-        </w:rPr>
-        <w:t xml:space="preserve">            Console.WriteLine($"User: {prompt}\n");</w:t>
-      </w:r>
-    </w:p>
-    <w:p>
-      <w:pPr>
-        <w:pStyle w:val="NoSpacing"/>
-        <w:rPr>
-          <w:rFonts w:ascii="Consolas" w:hAnsi="Consolas"/>
-          <w:sz w:val="19"/>
-        </w:rPr>
-      </w:pPr>
-      <w:r>
-        <w:rPr>
-          <w:rFonts w:ascii="Consolas" w:hAnsi="Consolas"/>
-          <w:sz w:val="19"/>
-        </w:rPr>
-        <w:t xml:space="preserve">            Console.WriteLine("--- EXECUTING &amp; TRACING ---");</w:t>
-      </w:r>
-    </w:p>
-    <w:p>
-      <w:pPr>
-        <w:pStyle w:val="NoSpacing"/>
-        <w:rPr>
-          <w:rFonts w:ascii="Consolas" w:hAnsi="Consolas"/>
-          <w:sz w:val="19"/>
-        </w:rPr>
-      </w:pPr>
-    </w:p>
-    <w:p>
-      <w:pPr>
-        <w:pStyle w:val="NoSpacing"/>
-        <w:rPr>
-          <w:rFonts w:ascii="Consolas" w:hAnsi="Consolas"/>
-          <w:sz w:val="19"/>
-        </w:rPr>
-      </w:pPr>
-      <w:r>
-        <w:rPr>
-          <w:rFonts w:ascii="Consolas" w:hAnsi="Consolas"/>
-          <w:sz w:val="19"/>
-        </w:rPr>
-        <w:t xml:space="preserve">            // The tracer is running in the background and will intercept activities here</w:t>
-      </w:r>
-    </w:p>
-    <w:p>
-      <w:pPr>
-        <w:pStyle w:val="NoSpacing"/>
-        <w:rPr>
-          <w:rFonts w:ascii="Consolas" w:hAnsi="Consolas"/>
-          <w:sz w:val="19"/>
-        </w:rPr>
-      </w:pPr>
-      <w:r>
-        <w:rPr>
-          <w:rFonts w:ascii="Consolas" w:hAnsi="Consolas"/>
-          <w:sz w:val="19"/>
-        </w:rPr>
-        <w:t xml:space="preserve">            var result = aw</w:t>
-      </w:r>
-      <w:r>
-        <w:rPr>
-          <w:rFonts w:ascii="Consolas" w:hAnsi="Consolas"/>
-          <w:sz w:val="19"/>
-        </w:rPr>
+        <w:t>Step 1: Building the TracerProvider First.</w:t>
+      </w:r>
+      <w:r>
+        <w:t xml:space="preserve"> The very first thing `Main` does — before even touching the `Kernel` — is build an OpenTelemetry `TracerProviderBuilder` via `Sdk.CreateTracerProviderBuilder()`. Ordering matters here: tracing infrastructure has to exist and be listening *before* any instrumented code runs, or the activities it's meant to capture will simply not be recorded. The `using TracerProvider tracerProvider = traceBuilder.Build()` both builds and starts the tracer, and the `using` ensures it's properly disposed (flushing any remaining buffered data) when `Main` exits.</w:t>
+      </w:r>
+    </w:p>
+    <w:p/>
+    <w:p>
+      <w:r>
+        <w:rPr>
+          <w:b/>
+        </w:rPr>
+        <w:t>Step 2: Subscribing to Semantic Kernel's Own Instrumentation.</w:t>
+      </w:r>
+      <w:r>
+        <w:t xml:space="preserve"> `traceBuilder.AddSource("Microsoft.SemanticKernel*")` is the single line that makes this whole lesson work. The Semantic Kernel library itself is already instrumented internally using .NET's standard `System.Diagnostics.Activity` APIs — it emits activities for prompt rendering, model calls, and plugin invocations as a normal part of its own execution, whether or not anyone is listening. This line simply tells OpenTelemetry's tracer to subscribe to any activity whose source name starts with `"Microsoft.SemanticKernel"`. No changes to `SlowWeatherPlugin` or any prompt code were needed to make this observability possible — it's already there, waiting to be tapped.</w:t>
+      </w:r>
+    </w:p>
+    <w:p/>
+    <w:p>
+      <w:r>
+        <w:rPr>
+          <w:b/>
+        </w:rPr>
+        <w:t>Step 3: The Console Exporter as a Teaching Tool.</w:t>
+      </w:r>
+      <w:r>
+        <w:t xml:space="preserve"> `traceBuilder.AddConsoleExporter()` is explicitly called out in the code's own comments as a tutorial-only choice: in a real production deployment, this line would be swapped for an OTLP exporter shipping data to a proper backend (Jaeger, Application Insights, Datadog, etc.). For this lesson, printing raw trace data straight to the terminal lets students see exactly what's being captured without standing up any external infrastructure.</w:t>
+      </w:r>
+    </w:p>
+    <w:p/>
+    <w:p>
+      <w:r>
+        <w:rPr>
+          <w:b/>
+        </w:rPr>
+        <w:t>Step 4: A Deliberately Slow Plugin (SlowWeatherPlugin.cs).</w:t>
+      </w:r>
+      <w:r>
+        <w:t xml:space="preserve"> `GetWeatherAsync` is a `[KernelFunction]` that does nothing more than `await Task.Delay(800)` before returning a canned weather string. The 800-millisecond artificial delay exists purely so that, when you look at the trace output, the plugin's span duration is unmistakably distinguishable from the surrounding LLM-call spans — it's a pedagogical trick to make "here's how long the tool itself took" obvious in a very short console session.</w:t>
+      </w:r>
+    </w:p>
+    <w:p/>
+    <w:p>
+      <w:r>
+        <w:rPr>
+          <w:b/>
+        </w:rPr>
+        <w:t>Step 5: Registering the Plugin and Enabling AutoInvoke.</w:t>
+      </w:r>
+      <w:r>
+        <w:t xml:space="preserve"> `builder.Plugins.AddFromType&lt;SlowWeatherPlugin&gt;()` registers the mock plugin on the </w:t>
+      </w:r>
+      <w:r>
         <w:lastRenderedPageBreak/>
-        <w:t>ait kernel.InvokePromptAsync(prompt, arguments);</w:t>
-      </w:r>
-    </w:p>
-    <w:p>
-      <w:pPr>
-        <w:pStyle w:val="NoSpacing"/>
-        <w:rPr>
-          <w:rFonts w:ascii="Consolas" w:hAnsi="Consolas"/>
-          <w:sz w:val="19"/>
-        </w:rPr>
-      </w:pPr>
-    </w:p>
-    <w:p>
-      <w:pPr>
-        <w:pStyle w:val="NoSpacing"/>
-        <w:rPr>
-          <w:rFonts w:ascii="Consolas" w:hAnsi="Consolas"/>
-          <w:sz w:val="19"/>
-        </w:rPr>
-      </w:pPr>
-      <w:r>
-        <w:rPr>
-          <w:rFonts w:ascii="Consolas" w:hAnsi="Consolas"/>
-          <w:sz w:val="19"/>
-        </w:rPr>
-        <w:t xml:space="preserve">            Console.WriteLine($"\nFinal AI Output: {result}");</w:t>
-      </w:r>
-    </w:p>
-    <w:p>
-      <w:pPr>
-        <w:pStyle w:val="NoSpacing"/>
-        <w:rPr>
-          <w:rFonts w:ascii="Consolas" w:hAnsi="Consolas"/>
-          <w:sz w:val="19"/>
-        </w:rPr>
-      </w:pPr>
-    </w:p>
-    <w:p>
-      <w:pPr>
-        <w:pStyle w:val="NoSpacing"/>
-        <w:rPr>
-          <w:rFonts w:ascii="Consolas" w:hAnsi="Consolas"/>
-          <w:sz w:val="19"/>
-        </w:rPr>
-      </w:pPr>
-      <w:r>
-        <w:rPr>
-          <w:rFonts w:ascii="Consolas" w:hAnsi="Consolas"/>
-          <w:sz w:val="19"/>
-        </w:rPr>
-        <w:t xml:space="preserve">            // Ensure all traces are flushed to the console before the program exits.</w:t>
-      </w:r>
-    </w:p>
-    <w:p>
-      <w:pPr>
-        <w:pStyle w:val="NoSpacing"/>
-        <w:rPr>
-          <w:rFonts w:ascii="Consolas" w:hAnsi="Consolas"/>
-          <w:sz w:val="19"/>
-        </w:rPr>
-      </w:pPr>
-      <w:r>
-        <w:rPr>
-          <w:rFonts w:ascii="Consolas" w:hAnsi="Consolas"/>
-          <w:sz w:val="19"/>
-        </w:rPr>
-        <w:t xml:space="preserve">            tracerProvider.ForceFlush();</w:t>
-      </w:r>
-    </w:p>
-    <w:p>
-      <w:pPr>
-        <w:pStyle w:val="NoSpacing"/>
-        <w:rPr>
-          <w:rFonts w:ascii="Consolas" w:hAnsi="Consolas"/>
-          <w:sz w:val="19"/>
-        </w:rPr>
-      </w:pPr>
-      <w:r>
-        <w:rPr>
-          <w:rFonts w:ascii="Consolas" w:hAnsi="Consolas"/>
-          <w:sz w:val="19"/>
-        </w:rPr>
-        <w:t xml:space="preserve">            Console.WriteLine("\nSession complete.  Review Open Telemetry traces above.");</w:t>
-      </w:r>
-    </w:p>
-    <w:p>
-      <w:pPr>
-        <w:pStyle w:val="NoSpacing"/>
-        <w:rPr>
-          <w:rFonts w:ascii="Consolas" w:hAnsi="Consolas"/>
-          <w:sz w:val="19"/>
-        </w:rPr>
-      </w:pPr>
-    </w:p>
-    <w:p>
-      <w:pPr>
-        <w:pStyle w:val="NoSpacing"/>
-        <w:rPr>
-          <w:rFonts w:ascii="Consolas" w:hAnsi="Consolas"/>
-          <w:sz w:val="19"/>
-        </w:rPr>
-      </w:pPr>
-      <w:r>
-        <w:rPr>
-          <w:rFonts w:ascii="Consolas" w:hAnsi="Consolas"/>
-          <w:sz w:val="19"/>
-        </w:rPr>
-        <w:t xml:space="preserve">        }</w:t>
-      </w:r>
-    </w:p>
-    <w:p>
-      <w:pPr>
-        <w:pStyle w:val="NoSpacing"/>
-        <w:rPr>
-          <w:rFonts w:ascii="Consolas" w:hAnsi="Consolas"/>
-          <w:sz w:val="19"/>
-        </w:rPr>
-      </w:pPr>
-      <w:r>
-        <w:rPr>
-          <w:rFonts w:ascii="Consolas" w:hAnsi="Consolas"/>
-          <w:sz w:val="19"/>
-        </w:rPr>
-        <w:t xml:space="preserve">    }</w:t>
-      </w:r>
-    </w:p>
-    <w:p>
-      <w:pPr>
-        <w:pStyle w:val="NoSpacing"/>
-        <w:rPr>
-          <w:rFonts w:ascii="Consolas" w:hAnsi="Consolas"/>
-          <w:sz w:val="19"/>
-        </w:rPr>
-      </w:pPr>
-      <w:r>
-        <w:rPr>
-          <w:rFonts w:ascii="Consolas" w:hAnsi="Consolas"/>
-          <w:sz w:val="19"/>
-        </w:rPr>
-        <w:t>}</w:t>
-      </w:r>
-    </w:p>
-    <w:p/>
-    <w:p>
-      <w:pPr>
-        <w:rPr>
-          <w:b/>
-        </w:rPr>
-      </w:pPr>
-      <w:r>
-        <w:rPr>
-          <w:b/>
-        </w:rPr>
-        <w:t>SlowWeatherPlugin.cs</w:t>
-      </w:r>
-    </w:p>
-    <w:p>
-      <w:pPr>
-        <w:pStyle w:val="NoSpacing"/>
-        <w:rPr>
-          <w:rFonts w:ascii="Consolas" w:hAnsi="Consolas"/>
-          <w:sz w:val="19"/>
-        </w:rPr>
-      </w:pPr>
-      <w:r>
-        <w:rPr>
-          <w:rFonts w:ascii="Consolas" w:hAnsi="Consolas"/>
-          <w:sz w:val="19"/>
-        </w:rPr>
-        <w:t>// SlowWeatherPlugin</w:t>
-      </w:r>
-    </w:p>
-    <w:p>
-      <w:pPr>
-        <w:pStyle w:val="NoSpacing"/>
-        <w:rPr>
-          <w:rFonts w:ascii="Consolas" w:hAnsi="Consolas"/>
-          <w:sz w:val="19"/>
-        </w:rPr>
-      </w:pPr>
-      <w:r>
-        <w:rPr>
-          <w:rFonts w:ascii="Consolas" w:hAnsi="Consolas"/>
-          <w:sz w:val="19"/>
-        </w:rPr>
-        <w:t>// ---------------------------------------------------------------------------</w:t>
-      </w:r>
-    </w:p>
-    <w:p>
-      <w:pPr>
-        <w:pStyle w:val="NoSpacing"/>
-        <w:rPr>
-          <w:rFonts w:ascii="Consolas" w:hAnsi="Consolas"/>
-          <w:sz w:val="19"/>
-        </w:rPr>
-      </w:pPr>
-      <w:r>
-        <w:rPr>
-          <w:rFonts w:ascii="Consolas" w:hAnsi="Consolas"/>
-          <w:sz w:val="19"/>
-        </w:rPr>
-        <w:t>// A mock plugin with a deliberate artificial delay, so its telemetry span</w:t>
-      </w:r>
-    </w:p>
-    <w:p>
-      <w:pPr>
-        <w:pStyle w:val="NoSpacing"/>
-        <w:rPr>
-          <w:rFonts w:ascii="Consolas" w:hAnsi="Consolas"/>
-          <w:sz w:val="19"/>
-        </w:rPr>
-      </w:pPr>
-      <w:r>
-        <w:rPr>
-          <w:rFonts w:ascii="Consolas" w:hAnsi="Consolas"/>
-          <w:sz w:val="19"/>
-        </w:rPr>
-        <w:t>// shows up with a clearly distinguishable duration from the surrounding</w:t>
-      </w:r>
-    </w:p>
-    <w:p>
-      <w:pPr>
-        <w:pStyle w:val="NoSpacing"/>
-        <w:rPr>
-          <w:rFonts w:ascii="Consolas" w:hAnsi="Consolas"/>
-          <w:sz w:val="19"/>
-        </w:rPr>
-      </w:pPr>
-      <w:r>
-        <w:rPr>
-          <w:rFonts w:ascii="Consolas" w:hAnsi="Consolas"/>
-          <w:sz w:val="19"/>
-        </w:rPr>
-        <w:t>// model-call spans when viewing the OpenTelemetry trace output.</w:t>
-      </w:r>
-    </w:p>
-    <w:p>
-      <w:pPr>
-        <w:pStyle w:val="NoSpacing"/>
-        <w:rPr>
-          <w:rFonts w:ascii="Consolas" w:hAnsi="Consolas"/>
-          <w:sz w:val="19"/>
-        </w:rPr>
-      </w:pPr>
-      <w:r>
-        <w:rPr>
-          <w:rFonts w:ascii="Consolas" w:hAnsi="Consolas"/>
-          <w:sz w:val="19"/>
-        </w:rPr>
-        <w:t>using Microsoft.SemanticKernel;</w:t>
-      </w:r>
-    </w:p>
-    <w:p>
-      <w:pPr>
-        <w:pStyle w:val="NoSpacing"/>
-        <w:rPr>
-          <w:rFonts w:ascii="Consolas" w:hAnsi="Consolas"/>
-          <w:sz w:val="19"/>
-        </w:rPr>
-      </w:pPr>
-      <w:r>
-        <w:rPr>
-          <w:rFonts w:ascii="Consolas" w:hAnsi="Consolas"/>
-          <w:sz w:val="19"/>
-        </w:rPr>
-        <w:t>using System.ComponentModel;</w:t>
-      </w:r>
-    </w:p>
-    <w:p>
-      <w:pPr>
-        <w:pStyle w:val="NoSpacing"/>
-        <w:rPr>
-          <w:rFonts w:ascii="Consolas" w:hAnsi="Consolas"/>
-          <w:sz w:val="19"/>
-        </w:rPr>
-      </w:pPr>
-    </w:p>
-    <w:p>
-      <w:pPr>
-        <w:pStyle w:val="NoSpacing"/>
-        <w:rPr>
-          <w:rFonts w:ascii="Consolas" w:hAnsi="Consolas"/>
-          <w:sz w:val="19"/>
-        </w:rPr>
-      </w:pPr>
-      <w:r>
-        <w:rPr>
-          <w:rFonts w:ascii="Consolas" w:hAnsi="Consolas"/>
-          <w:sz w:val="19"/>
-        </w:rPr>
-        <w:t>namespace Telemetry</w:t>
-      </w:r>
-    </w:p>
-    <w:p>
-      <w:pPr>
-        <w:pStyle w:val="NoSpacing"/>
-        <w:rPr>
-          <w:rFonts w:ascii="Consolas" w:hAnsi="Consolas"/>
-          <w:sz w:val="19"/>
-        </w:rPr>
-      </w:pPr>
-      <w:r>
-        <w:rPr>
-          <w:rFonts w:ascii="Consolas" w:hAnsi="Consolas"/>
-          <w:sz w:val="19"/>
-        </w:rPr>
-        <w:t>{</w:t>
-      </w:r>
-    </w:p>
-    <w:p>
-      <w:pPr>
-        <w:pStyle w:val="NoSpacing"/>
-        <w:rPr>
-          <w:rFonts w:ascii="Consolas" w:hAnsi="Consolas"/>
-          <w:sz w:val="19"/>
-        </w:rPr>
-      </w:pPr>
-      <w:r>
-        <w:rPr>
-          <w:rFonts w:ascii="Consolas" w:hAnsi="Consolas"/>
-          <w:sz w:val="19"/>
-        </w:rPr>
-        <w:t xml:space="preserve">    internal class SlowWeatherPlugin</w:t>
-      </w:r>
-    </w:p>
-    <w:p>
-      <w:pPr>
-        <w:pStyle w:val="NoSpacing"/>
-        <w:rPr>
-          <w:rFonts w:ascii="Consolas" w:hAnsi="Consolas"/>
-          <w:sz w:val="19"/>
-        </w:rPr>
-      </w:pPr>
-      <w:r>
-        <w:rPr>
-          <w:rFonts w:ascii="Consolas" w:hAnsi="Consolas"/>
-          <w:sz w:val="19"/>
-        </w:rPr>
-        <w:t xml:space="preserve">    {</w:t>
-      </w:r>
-    </w:p>
-    <w:p>
-      <w:pPr>
-        <w:pStyle w:val="NoSpacing"/>
-        <w:rPr>
-          <w:rFonts w:ascii="Consolas" w:hAnsi="Consolas"/>
-          <w:sz w:val="19"/>
-        </w:rPr>
-      </w:pPr>
-      <w:r>
-        <w:rPr>
-          <w:rFonts w:ascii="Consolas" w:hAnsi="Consolas"/>
-          <w:sz w:val="19"/>
-        </w:rPr>
-        <w:t xml:space="preserve">        [KernelFunction("GetWeather")]</w:t>
-      </w:r>
-    </w:p>
-    <w:p>
-      <w:pPr>
-        <w:pStyle w:val="NoSpacing"/>
-        <w:rPr>
-          <w:rFonts w:ascii="Consolas" w:hAnsi="Consolas"/>
-          <w:sz w:val="19"/>
-        </w:rPr>
-      </w:pPr>
-      <w:r>
-        <w:rPr>
-          <w:rFonts w:ascii="Consolas" w:hAnsi="Consolas"/>
-          <w:sz w:val="19"/>
-        </w:rPr>
-        <w:t xml:space="preserve">        [Description("Gets the current weather for a specificy city.")]</w:t>
-      </w:r>
-    </w:p>
-    <w:p>
-      <w:pPr>
-        <w:pStyle w:val="NoSpacing"/>
-        <w:rPr>
-          <w:rFonts w:ascii="Consolas" w:hAnsi="Consolas"/>
-          <w:sz w:val="19"/>
-        </w:rPr>
-      </w:pPr>
-      <w:r>
-        <w:rPr>
-          <w:rFonts w:ascii="Consolas" w:hAnsi="Consolas"/>
-          <w:sz w:val="19"/>
-        </w:rPr>
-        <w:t xml:space="preserve">        public async Task&lt;string&gt; GetWeatherAsync([Description("The city name")] string city)</w:t>
-      </w:r>
-    </w:p>
-    <w:p>
-      <w:pPr>
-        <w:pStyle w:val="NoSpacing"/>
-        <w:rPr>
-          <w:rFonts w:ascii="Consolas" w:hAnsi="Consolas"/>
-          <w:sz w:val="19"/>
-        </w:rPr>
-      </w:pPr>
-      <w:r>
-        <w:rPr>
-          <w:rFonts w:ascii="Consolas" w:hAnsi="Consolas"/>
-          <w:sz w:val="19"/>
-        </w:rPr>
-        <w:t xml:space="preserve">        {</w:t>
-      </w:r>
-    </w:p>
-    <w:p>
-      <w:pPr>
-        <w:pStyle w:val="NoSpacing"/>
-        <w:rPr>
-          <w:rFonts w:ascii="Consolas" w:hAnsi="Consolas"/>
-          <w:sz w:val="19"/>
-        </w:rPr>
-      </w:pPr>
-      <w:r>
-        <w:rPr>
-          <w:rFonts w:ascii="Consolas" w:hAnsi="Consolas"/>
-          <w:sz w:val="19"/>
-        </w:rPr>
-        <w:t xml:space="preserve">            // Simulate network latency (e.g. reaching out to a weather REST API)</w:t>
-      </w:r>
-    </w:p>
-    <w:p>
-      <w:pPr>
-        <w:pStyle w:val="NoSpacing"/>
-        <w:rPr>
-          <w:rFonts w:ascii="Consolas" w:hAnsi="Consolas"/>
-          <w:sz w:val="19"/>
-        </w:rPr>
-      </w:pPr>
-      <w:r>
-        <w:rPr>
-          <w:rFonts w:ascii="Consolas" w:hAnsi="Consolas"/>
-          <w:sz w:val="19"/>
-        </w:rPr>
-        <w:t xml:space="preserve">            await Task.Delay(800);</w:t>
-      </w:r>
-    </w:p>
-    <w:p>
-      <w:pPr>
-        <w:pStyle w:val="NoSpacing"/>
-        <w:rPr>
-          <w:rFonts w:ascii="Consolas" w:hAnsi="Consolas"/>
-          <w:sz w:val="19"/>
-        </w:rPr>
-      </w:pPr>
-      <w:r>
-        <w:rPr>
-          <w:rFonts w:ascii="Consolas" w:hAnsi="Consolas"/>
-          <w:sz w:val="19"/>
-        </w:rPr>
-        <w:t xml:space="preserve">            return $"The weather in {city} is currenlty 72°F and sunny.";</w:t>
-      </w:r>
-    </w:p>
-    <w:p>
-      <w:pPr>
-        <w:pStyle w:val="NoSpacing"/>
-        <w:rPr>
-          <w:rFonts w:ascii="Consolas" w:hAnsi="Consolas"/>
-          <w:sz w:val="19"/>
-        </w:rPr>
-      </w:pPr>
-      <w:r>
-        <w:rPr>
-          <w:rFonts w:ascii="Consolas" w:hAnsi="Consolas"/>
-          <w:sz w:val="19"/>
-        </w:rPr>
-        <w:t xml:space="preserve">        }</w:t>
-      </w:r>
-    </w:p>
-    <w:p>
-      <w:pPr>
-        <w:pStyle w:val="NoSpacing"/>
-        <w:rPr>
-          <w:rFonts w:ascii="Consolas" w:hAnsi="Consolas"/>
-          <w:sz w:val="19"/>
-        </w:rPr>
-      </w:pPr>
-      <w:r>
-        <w:rPr>
-          <w:rFonts w:ascii="Consolas" w:hAnsi="Consolas"/>
-          <w:sz w:val="19"/>
-        </w:rPr>
-        <w:t xml:space="preserve">    }</w:t>
-      </w:r>
-    </w:p>
-    <w:p>
-      <w:pPr>
-        <w:pStyle w:val="NoSpacing"/>
-        <w:rPr>
-          <w:rFonts w:ascii="Consolas" w:hAnsi="Consolas"/>
-          <w:sz w:val="19"/>
-        </w:rPr>
-      </w:pPr>
-      <w:r>
-        <w:rPr>
-          <w:rFonts w:ascii="Consolas" w:hAnsi="Consolas"/>
-          <w:sz w:val="19"/>
-        </w:rPr>
-        <w:t>}</w:t>
-      </w:r>
-    </w:p>
-    <w:p/>
-    <w:p>
-      <w:pPr>
-        <w:pStyle w:val="Heading2"/>
-      </w:pPr>
-      <w:r>
-        <w:t>5. Code Walkthrough &amp; Explanations</w:t>
-      </w:r>
-    </w:p>
-    <w:p/>
-    <w:p>
-      <w:r>
-        <w:rPr>
-          <w:b/>
-        </w:rPr>
-        <w:t>Step 1: Building the TracerProvider First.</w:t>
-      </w:r>
-      <w:r>
-        <w:t xml:space="preserve"> The very first thing `Main` does — before even touching the `Kernel` — is build an OpenTelemetry `TracerProviderBuilder` via `Sdk.CreateTracerProviderBuilder()`. Ordering matters here: tracing infrastructure has to exist and be listening *before* any instrumented code runs, or the activities it's meant to capture will simply not be recorded. The `using TracerProvider tracerProvider = traceBuilder.Build()` both builds and starts the tracer, and the `using` ensures it's properly disposed (flushing any remaining buffered data) when `Main` exits.</w:t>
-      </w:r>
-    </w:p>
-    <w:p/>
-    <w:p>
-      <w:r>
-        <w:rPr>
-          <w:b/>
-        </w:rPr>
-        <w:t>Step 2: Subscribing to Semantic Kernel's Own Instrumentation.</w:t>
-      </w:r>
-      <w:r>
-        <w:t xml:space="preserve"> `traceBuilder.AddSource("Microsoft.SemanticKernel*")` is the single line that makes this whole lesson work. The Semantic Kernel library itself is already instrumented internally using .NET's standard `System.Diagnostics.Activity` APIs — it emits activities for prompt rendering, model calls, and plugin invocations as a normal part of its own execution, whether or not anyone is listening. This line simply tells OpenTelemetry's tracer to subscribe to any activity whose source name starts with `"Microsoft.SemanticKernel"`. No changes to `SlowWeatherPlugin` or any prompt code were needed to make this observability possible — it's already there, waiting to be tapped.</w:t>
-      </w:r>
-    </w:p>
-    <w:p/>
-    <w:p>
-      <w:r>
-        <w:rPr>
-          <w:b/>
-        </w:rPr>
-        <w:t>Step 3: The Console Exporter as a Teaching Tool.</w:t>
-      </w:r>
-      <w:r>
-        <w:t xml:space="preserve"> `traceBuilder.AddConsoleExporter()` is explicitly called out in the code's own comments as a tutorial-only choice: in a real production deployment, this line would be swapped for an OTLP exporter shipping data to a proper backend (Jaeger, Application Insights, Datadog, etc.). For this lesson, printing raw trace data straight to the terminal lets students see exactly what's being captured without standing up any external infrastructure.</w:t>
-      </w:r>
-    </w:p>
-    <w:p/>
-    <w:p>
-      <w:r>
-        <w:rPr>
-          <w:b/>
-        </w:rPr>
-        <w:t>Step 4: A Deliberately Slow Plugin (SlowWeatherPlugin.cs).</w:t>
-      </w:r>
-      <w:r>
-        <w:t xml:space="preserve"> `GetWeatherAsync` is a `[KernelFunction]` that does nothing more than `await Task.Delay(800)` before returning a canned weather string. The 800-millisecond artificial delay exists purely so that, when you look at the trace output, the plugin's span duration is unmistakably distinguishable from the surrounding LLM-call spans — it's a pedagogical trick to make "here's how long the tool itself took" obvious in a very short console session.</w:t>
-      </w:r>
-    </w:p>
-    <w:p/>
-    <w:p>
-      <w:r>
-        <w:rPr>
-          <w:b/>
-        </w:rPr>
-        <w:t>Step 5: Registering the Plugin and Enabling AutoInvoke.</w:t>
-      </w:r>
-      <w:r>
-        <w:t xml:space="preserve"> `builder.Plugins.AddFromType&lt;SlowWeatherPlugin&gt;()` registers the mock plugin on the kernel, and `settings.ToolCallBehavior = GeminiToolCallBehavior.AutoInvokeKernelFunctions` tells Semantic Kernel to let Gemini decide it needs the weather tool and execute it automatically. This combination is what produces *multiple* distinct spans from a single `InvokePromptAsync` call: one for the first LLM call (where Gemini decides to call `GetWeather`), one for the actual plugin execution (~800ms, thanks to the artificial delay), and one more for the follow-up LLM call where Gemini turns the raw tool result into a natural-language sentence.</w:t>
+        <w:t>kernel, and `settings.ToolCallBehavior = GeminiToolCallBehavior.AutoInvokeKernelFunctions` tells Semantic Kernel to let Gemini decide it needs the weather tool and execute it automatically. This combination is what produces *multiple* distinct spans from a single `InvokePromptAsync` call: one for the first LLM call (where Gemini decides to call `GetWeather`), one for the actual plugin execution (~800ms, thanks to the artificial delay), and one more for the follow-up LLM call where Gemini turns the raw tool result into a natural-language sentence.</w:t>
       </w:r>
     </w:p>
     <w:p/>

</xml_diff>